<commit_message>
Sincronizacion  del documento de Semana 7 con la correccion del UML de Adapter
</commit_message>
<xml_diff>
--- a/Documentacion/Semana 7/plataforma-Comercio-Energia.docx
+++ b/Documentacion/Semana 7/plataforma-Comercio-Energia.docx
@@ -4019,7 +4019,21 @@
           <w:lang w:val="es-CO"/>
         </w:rPr>
         <w:lastRenderedPageBreak/>
-        <w:t xml:space="preserve">Figura 21. Método clonar() de </w:t>
+        <w:t xml:space="preserve">Figura 21. Método </w:t>
+      </w:r>
+      <w:proofErr w:type="gramStart"/>
+      <w:r>
+        <w:rPr>
+          <w:lang w:val="es-CO"/>
+        </w:rPr>
+        <w:t>clonar(</w:t>
+      </w:r>
+      <w:proofErr w:type="gramEnd"/>
+      <w:r>
+        <w:rPr>
+          <w:lang w:val="es-CO"/>
+        </w:rPr>
+        <w:t xml:space="preserve">) de </w:t>
       </w:r>
       <w:proofErr w:type="spellStart"/>
       <w:r>
@@ -4363,7 +4377,7 @@
         <w:rPr>
           <w:lang w:val="es-CO"/>
         </w:rPr>
-        <w:t>Figura 26. Interfaz de la plataforma: pestaña Pagos con la pasarela PayU seleccionada y sin cobros todavía</w:t>
+        <w:t>Figura 26. Diagrama UML de clases del patrón Adapter aplicado al cobro de pagos</w:t>
       </w:r>
       <w:r>
         <w:rPr>
@@ -4409,7 +4423,7 @@
         <w:rPr>
           <w:lang w:val="es-CO"/>
         </w:rPr>
-        <w:t>Figura 27. Interfaz de la plataforma: historial de pagos cobrados por Stripe tras ejecutar la subasta</w:t>
+        <w:t>Figura 27. Interfaz de la plataforma: pestaña Pagos con la pasarela PayU seleccionada y sin cobros todavía</w:t>
       </w:r>
       <w:r>
         <w:rPr>
@@ -4455,7 +4469,7 @@
         <w:rPr>
           <w:lang w:val="es-CO"/>
         </w:rPr>
-        <w:t>Figura 28. Interfaz de la plataforma: pestaña Mercado con el libro de órdenes tras varias subastas ejecutadas</w:t>
+        <w:t>Figura 28. Interfaz de la plataforma: historial de pagos cobrados por Stripe tras ejecutar la subasta</w:t>
       </w:r>
       <w:r>
         <w:rPr>
@@ -4501,7 +4515,7 @@
         <w:rPr>
           <w:lang w:val="es-CO"/>
         </w:rPr>
-        <w:t>Figura 29. Interfaz de la plataforma: historial de pagos combinando cobros de Stripe y PayU</w:t>
+        <w:t>Figura 29. Interfaz de la plataforma: pestaña Mercado con el libro de órdenes tras varias subastas ejecutadas</w:t>
       </w:r>
       <w:r>
         <w:rPr>
@@ -4517,6 +4531,52 @@
           <w:lang w:val="es-CO"/>
         </w:rPr>
         <w:instrText>PAGEREF bm_fig29 \h</w:instrText>
+      </w:r>
+      <w:r>
+        <w:fldChar w:fldCharType="separate"/>
+      </w:r>
+      <w:r>
+        <w:rPr>
+          <w:noProof/>
+          <w:lang w:val="es-CO"/>
+        </w:rPr>
+        <w:t>1</w:t>
+      </w:r>
+      <w:r>
+        <w:fldChar w:fldCharType="end"/>
+      </w:r>
+    </w:p>
+    <w:p>
+      <w:pPr>
+        <w:tabs>
+          <w:tab w:val="right" w:leader="dot" w:pos="9360"/>
+        </w:tabs>
+        <w:spacing w:after="80" w:line="360" w:lineRule="auto"/>
+        <w:ind w:left="360" w:hanging="360"/>
+        <w:rPr>
+          <w:lang w:val="es-CO"/>
+        </w:rPr>
+      </w:pPr>
+      <w:r>
+        <w:rPr>
+          <w:lang w:val="es-CO"/>
+        </w:rPr>
+        <w:t>Figura 30. Interfaz de la plataforma: historial de pagos combinando cobros de Stripe y PayU</w:t>
+      </w:r>
+      <w:r>
+        <w:rPr>
+          <w:lang w:val="es-CO"/>
+        </w:rPr>
+        <w:tab/>
+      </w:r>
+      <w:r>
+        <w:fldChar w:fldCharType="begin"/>
+      </w:r>
+      <w:r>
+        <w:rPr>
+          <w:lang w:val="es-CO"/>
+        </w:rPr>
+        <w:instrText>PAGEREF bm_fig30 \h</w:instrText>
       </w:r>
       <w:r>
         <w:fldChar w:fldCharType="separate"/>
@@ -5976,6 +6036,7 @@
         <w:t xml:space="preserve">_instances: </w:t>
       </w:r>
       <w:proofErr w:type="spellStart"/>
+      <w:proofErr w:type="gramStart"/>
       <w:r>
         <w:rPr>
           <w:rFonts w:ascii="Courier New" w:eastAsia="Courier New" w:hAnsi="Courier New" w:cs="Courier New"/>
@@ -5991,7 +6052,16 @@
           <w:sz w:val="20"/>
           <w:szCs w:val="20"/>
         </w:rPr>
-        <w:t>[type, object] = {}</w:t>
+        <w:t>[</w:t>
+      </w:r>
+      <w:proofErr w:type="gramEnd"/>
+      <w:r>
+        <w:rPr>
+          <w:rFonts w:ascii="Courier New" w:eastAsia="Courier New" w:hAnsi="Courier New" w:cs="Courier New"/>
+          <w:sz w:val="20"/>
+          <w:szCs w:val="20"/>
+        </w:rPr>
+        <w:t>type, object] = {}</w:t>
       </w:r>
     </w:p>
     <w:p>
@@ -6004,7 +6074,25 @@
           <w:sz w:val="20"/>
           <w:szCs w:val="20"/>
         </w:rPr>
-        <w:t xml:space="preserve">    _lock: Lock = Lock()</w:t>
+        <w:t xml:space="preserve">    _lock: Lock = </w:t>
+      </w:r>
+      <w:proofErr w:type="gramStart"/>
+      <w:r>
+        <w:rPr>
+          <w:rFonts w:ascii="Courier New" w:eastAsia="Courier New" w:hAnsi="Courier New" w:cs="Courier New"/>
+          <w:sz w:val="20"/>
+          <w:szCs w:val="20"/>
+        </w:rPr>
+        <w:t>Lock(</w:t>
+      </w:r>
+      <w:proofErr w:type="gramEnd"/>
+      <w:r>
+        <w:rPr>
+          <w:rFonts w:ascii="Courier New" w:eastAsia="Courier New" w:hAnsi="Courier New" w:cs="Courier New"/>
+          <w:sz w:val="20"/>
+          <w:szCs w:val="20"/>
+        </w:rPr>
+        <w:t>)</w:t>
       </w:r>
     </w:p>
     <w:p>
@@ -6030,9 +6118,19 @@
           <w:sz w:val="20"/>
           <w:szCs w:val="20"/>
         </w:rPr>
-        <w:t xml:space="preserve">    def __call__(</w:t>
-      </w:r>
-      <w:proofErr w:type="spellStart"/>
+        <w:t xml:space="preserve">    def __call_</w:t>
+      </w:r>
+      <w:proofErr w:type="gramStart"/>
+      <w:r>
+        <w:rPr>
+          <w:rFonts w:ascii="Courier New" w:eastAsia="Courier New" w:hAnsi="Courier New" w:cs="Courier New"/>
+          <w:sz w:val="20"/>
+          <w:szCs w:val="20"/>
+        </w:rPr>
+        <w:t>_(</w:t>
+      </w:r>
+      <w:proofErr w:type="spellStart"/>
+      <w:proofErr w:type="gramEnd"/>
       <w:r>
         <w:rPr>
           <w:rFonts w:ascii="Courier New" w:eastAsia="Courier New" w:hAnsi="Courier New" w:cs="Courier New"/>
@@ -6118,6 +6216,7 @@
         <w:t xml:space="preserve"> not in </w:t>
       </w:r>
       <w:proofErr w:type="spellStart"/>
+      <w:proofErr w:type="gramStart"/>
       <w:r>
         <w:rPr>
           <w:rFonts w:ascii="Courier New" w:eastAsia="Courier New" w:hAnsi="Courier New" w:cs="Courier New"/>
@@ -6133,7 +6232,16 @@
           <w:sz w:val="20"/>
           <w:szCs w:val="20"/>
         </w:rPr>
-        <w:t>._instances:</w:t>
+        <w:t>._</w:t>
+      </w:r>
+      <w:proofErr w:type="gramEnd"/>
+      <w:r>
+        <w:rPr>
+          <w:rFonts w:ascii="Courier New" w:eastAsia="Courier New" w:hAnsi="Courier New" w:cs="Courier New"/>
+          <w:sz w:val="20"/>
+          <w:szCs w:val="20"/>
+        </w:rPr>
+        <w:t>instances:</w:t>
       </w:r>
     </w:p>
     <w:p>
@@ -6149,6 +6257,7 @@
         <w:t xml:space="preserve">            with </w:t>
       </w:r>
       <w:proofErr w:type="spellStart"/>
+      <w:proofErr w:type="gramStart"/>
       <w:r>
         <w:rPr>
           <w:rFonts w:ascii="Courier New" w:eastAsia="Courier New" w:hAnsi="Courier New" w:cs="Courier New"/>
@@ -6164,7 +6273,16 @@
           <w:sz w:val="20"/>
           <w:szCs w:val="20"/>
         </w:rPr>
-        <w:t>._lock:</w:t>
+        <w:t>._</w:t>
+      </w:r>
+      <w:proofErr w:type="gramEnd"/>
+      <w:r>
+        <w:rPr>
+          <w:rFonts w:ascii="Courier New" w:eastAsia="Courier New" w:hAnsi="Courier New" w:cs="Courier New"/>
+          <w:sz w:val="20"/>
+          <w:szCs w:val="20"/>
+        </w:rPr>
+        <w:t>lock:</w:t>
       </w:r>
     </w:p>
     <w:p>
@@ -6198,6 +6316,7 @@
         <w:t xml:space="preserve"> not in </w:t>
       </w:r>
       <w:proofErr w:type="spellStart"/>
+      <w:proofErr w:type="gramStart"/>
       <w:r>
         <w:rPr>
           <w:rFonts w:ascii="Courier New" w:eastAsia="Courier New" w:hAnsi="Courier New" w:cs="Courier New"/>
@@ -6213,7 +6332,16 @@
           <w:sz w:val="20"/>
           <w:szCs w:val="20"/>
         </w:rPr>
-        <w:t>._instances:</w:t>
+        <w:t>._</w:t>
+      </w:r>
+      <w:proofErr w:type="gramEnd"/>
+      <w:r>
+        <w:rPr>
+          <w:rFonts w:ascii="Courier New" w:eastAsia="Courier New" w:hAnsi="Courier New" w:cs="Courier New"/>
+          <w:sz w:val="20"/>
+          <w:szCs w:val="20"/>
+        </w:rPr>
+        <w:t>instances:</w:t>
       </w:r>
     </w:p>
     <w:p>
@@ -6229,6 +6357,7 @@
         <w:t xml:space="preserve">                    </w:t>
       </w:r>
       <w:proofErr w:type="spellStart"/>
+      <w:proofErr w:type="gramStart"/>
       <w:r>
         <w:rPr>
           <w:rFonts w:ascii="Courier New" w:eastAsia="Courier New" w:hAnsi="Courier New" w:cs="Courier New"/>
@@ -6244,7 +6373,16 @@
           <w:sz w:val="20"/>
           <w:szCs w:val="20"/>
         </w:rPr>
-        <w:t>._instances[</w:t>
+        <w:t>._</w:t>
+      </w:r>
+      <w:proofErr w:type="gramEnd"/>
+      <w:r>
+        <w:rPr>
+          <w:rFonts w:ascii="Courier New" w:eastAsia="Courier New" w:hAnsi="Courier New" w:cs="Courier New"/>
+          <w:sz w:val="20"/>
+          <w:szCs w:val="20"/>
+        </w:rPr>
+        <w:t>instances[</w:t>
       </w:r>
       <w:proofErr w:type="spellStart"/>
       <w:r>
@@ -6262,7 +6400,43 @@
           <w:sz w:val="20"/>
           <w:szCs w:val="20"/>
         </w:rPr>
-        <w:t>] = super().__call__(*</w:t>
+        <w:t xml:space="preserve">] = </w:t>
+      </w:r>
+      <w:proofErr w:type="gramStart"/>
+      <w:r>
+        <w:rPr>
+          <w:rFonts w:ascii="Courier New" w:eastAsia="Courier New" w:hAnsi="Courier New" w:cs="Courier New"/>
+          <w:sz w:val="20"/>
+          <w:szCs w:val="20"/>
+        </w:rPr>
+        <w:t>super()._</w:t>
+      </w:r>
+      <w:proofErr w:type="gramEnd"/>
+      <w:r>
+        <w:rPr>
+          <w:rFonts w:ascii="Courier New" w:eastAsia="Courier New" w:hAnsi="Courier New" w:cs="Courier New"/>
+          <w:sz w:val="20"/>
+          <w:szCs w:val="20"/>
+        </w:rPr>
+        <w:t>_call_</w:t>
+      </w:r>
+      <w:proofErr w:type="gramStart"/>
+      <w:r>
+        <w:rPr>
+          <w:rFonts w:ascii="Courier New" w:eastAsia="Courier New" w:hAnsi="Courier New" w:cs="Courier New"/>
+          <w:sz w:val="20"/>
+          <w:szCs w:val="20"/>
+        </w:rPr>
+        <w:t>_(</w:t>
+      </w:r>
+      <w:proofErr w:type="gramEnd"/>
+      <w:r>
+        <w:rPr>
+          <w:rFonts w:ascii="Courier New" w:eastAsia="Courier New" w:hAnsi="Courier New" w:cs="Courier New"/>
+          <w:sz w:val="20"/>
+          <w:szCs w:val="20"/>
+        </w:rPr>
+        <w:t>*</w:t>
       </w:r>
       <w:proofErr w:type="spellStart"/>
       <w:r>
@@ -6314,6 +6488,7 @@
         <w:t xml:space="preserve">        return </w:t>
       </w:r>
       <w:proofErr w:type="spellStart"/>
+      <w:proofErr w:type="gramStart"/>
       <w:r>
         <w:rPr>
           <w:rFonts w:ascii="Courier New" w:eastAsia="Courier New" w:hAnsi="Courier New" w:cs="Courier New"/>
@@ -6329,7 +6504,16 @@
           <w:sz w:val="20"/>
           <w:szCs w:val="20"/>
         </w:rPr>
-        <w:t>._instances[</w:t>
+        <w:t>._</w:t>
+      </w:r>
+      <w:proofErr w:type="gramEnd"/>
+      <w:r>
+        <w:rPr>
+          <w:rFonts w:ascii="Courier New" w:eastAsia="Courier New" w:hAnsi="Courier New" w:cs="Courier New"/>
+          <w:sz w:val="20"/>
+          <w:szCs w:val="20"/>
+        </w:rPr>
+        <w:t>instances[</w:t>
       </w:r>
       <w:proofErr w:type="spellStart"/>
       <w:r>
@@ -6529,9 +6713,6 @@
     <w:p>
       <w:pPr>
         <w:ind w:left="720"/>
-        <w:rPr>
-          <w:lang w:val="es-CO"/>
-        </w:rPr>
       </w:pPr>
       <w:r>
         <w:rPr>
@@ -6542,32 +6723,32 @@
         <w:t xml:space="preserve">        </w:t>
       </w:r>
       <w:proofErr w:type="spellStart"/>
-      <w:r>
-        <w:rPr>
-          <w:rFonts w:ascii="Courier New" w:eastAsia="Courier New" w:hAnsi="Courier New" w:cs="Courier New"/>
-          <w:sz w:val="20"/>
-          <w:szCs w:val="20"/>
-          <w:lang w:val="es-CO"/>
+      <w:proofErr w:type="gramStart"/>
+      <w:r>
+        <w:rPr>
+          <w:rFonts w:ascii="Courier New" w:eastAsia="Courier New" w:hAnsi="Courier New" w:cs="Courier New"/>
+          <w:sz w:val="20"/>
+          <w:szCs w:val="20"/>
         </w:rPr>
         <w:t>self.usuarios</w:t>
       </w:r>
       <w:proofErr w:type="spellEnd"/>
-      <w:r>
-        <w:rPr>
-          <w:rFonts w:ascii="Courier New" w:eastAsia="Courier New" w:hAnsi="Courier New" w:cs="Courier New"/>
-          <w:sz w:val="20"/>
-          <w:szCs w:val="20"/>
-          <w:lang w:val="es-CO"/>
+      <w:proofErr w:type="gramEnd"/>
+      <w:r>
+        <w:rPr>
+          <w:rFonts w:ascii="Courier New" w:eastAsia="Courier New" w:hAnsi="Courier New" w:cs="Courier New"/>
+          <w:sz w:val="20"/>
+          <w:szCs w:val="20"/>
         </w:rPr>
         <w:t xml:space="preserve">: </w:t>
       </w:r>
       <w:proofErr w:type="spellStart"/>
-      <w:r>
-        <w:rPr>
-          <w:rFonts w:ascii="Courier New" w:eastAsia="Courier New" w:hAnsi="Courier New" w:cs="Courier New"/>
-          <w:sz w:val="20"/>
-          <w:szCs w:val="20"/>
-          <w:lang w:val="es-CO"/>
+      <w:proofErr w:type="gramStart"/>
+      <w:r>
+        <w:rPr>
+          <w:rFonts w:ascii="Courier New" w:eastAsia="Courier New" w:hAnsi="Courier New" w:cs="Courier New"/>
+          <w:sz w:val="20"/>
+          <w:szCs w:val="20"/>
         </w:rPr>
         <w:t>dict</w:t>
       </w:r>
@@ -6577,11 +6758,97 @@
           <w:rFonts w:ascii="Courier New" w:eastAsia="Courier New" w:hAnsi="Courier New" w:cs="Courier New"/>
           <w:sz w:val="20"/>
           <w:szCs w:val="20"/>
-          <w:lang w:val="es-CO"/>
         </w:rPr>
         <w:t>[</w:t>
       </w:r>
-      <w:proofErr w:type="spellStart"/>
+      <w:proofErr w:type="gramEnd"/>
+      <w:r>
+        <w:rPr>
+          <w:rFonts w:ascii="Courier New" w:eastAsia="Courier New" w:hAnsi="Courier New" w:cs="Courier New"/>
+          <w:sz w:val="20"/>
+          <w:szCs w:val="20"/>
+        </w:rPr>
+        <w:t xml:space="preserve">str, </w:t>
+      </w:r>
+      <w:proofErr w:type="spellStart"/>
+      <w:r>
+        <w:rPr>
+          <w:rFonts w:ascii="Courier New" w:eastAsia="Courier New" w:hAnsi="Courier New" w:cs="Courier New"/>
+          <w:sz w:val="20"/>
+          <w:szCs w:val="20"/>
+        </w:rPr>
+        <w:t>Usuario</w:t>
+      </w:r>
+      <w:proofErr w:type="spellEnd"/>
+      <w:r>
+        <w:rPr>
+          <w:rFonts w:ascii="Courier New" w:eastAsia="Courier New" w:hAnsi="Courier New" w:cs="Courier New"/>
+          <w:sz w:val="20"/>
+          <w:szCs w:val="20"/>
+        </w:rPr>
+        <w:t>] = {}</w:t>
+      </w:r>
+    </w:p>
+    <w:p>
+      <w:pPr>
+        <w:ind w:left="720"/>
+        <w:rPr>
+          <w:lang w:val="es-CO"/>
+        </w:rPr>
+      </w:pPr>
+      <w:r>
+        <w:rPr>
+          <w:rFonts w:ascii="Courier New" w:eastAsia="Courier New" w:hAnsi="Courier New" w:cs="Courier New"/>
+          <w:sz w:val="20"/>
+          <w:szCs w:val="20"/>
+        </w:rPr>
+        <w:t xml:space="preserve">        </w:t>
+      </w:r>
+      <w:proofErr w:type="spellStart"/>
+      <w:proofErr w:type="gramStart"/>
+      <w:r>
+        <w:rPr>
+          <w:rFonts w:ascii="Courier New" w:eastAsia="Courier New" w:hAnsi="Courier New" w:cs="Courier New"/>
+          <w:sz w:val="20"/>
+          <w:szCs w:val="20"/>
+          <w:lang w:val="es-CO"/>
+        </w:rPr>
+        <w:t>self.dispositivos</w:t>
+      </w:r>
+      <w:proofErr w:type="spellEnd"/>
+      <w:proofErr w:type="gramEnd"/>
+      <w:r>
+        <w:rPr>
+          <w:rFonts w:ascii="Courier New" w:eastAsia="Courier New" w:hAnsi="Courier New" w:cs="Courier New"/>
+          <w:sz w:val="20"/>
+          <w:szCs w:val="20"/>
+          <w:lang w:val="es-CO"/>
+        </w:rPr>
+        <w:t xml:space="preserve">: </w:t>
+      </w:r>
+      <w:proofErr w:type="spellStart"/>
+      <w:proofErr w:type="gramStart"/>
+      <w:r>
+        <w:rPr>
+          <w:rFonts w:ascii="Courier New" w:eastAsia="Courier New" w:hAnsi="Courier New" w:cs="Courier New"/>
+          <w:sz w:val="20"/>
+          <w:szCs w:val="20"/>
+          <w:lang w:val="es-CO"/>
+        </w:rPr>
+        <w:t>dict</w:t>
+      </w:r>
+      <w:proofErr w:type="spellEnd"/>
+      <w:r>
+        <w:rPr>
+          <w:rFonts w:ascii="Courier New" w:eastAsia="Courier New" w:hAnsi="Courier New" w:cs="Courier New"/>
+          <w:sz w:val="20"/>
+          <w:szCs w:val="20"/>
+          <w:lang w:val="es-CO"/>
+        </w:rPr>
+        <w:t>[</w:t>
+      </w:r>
+      <w:proofErr w:type="spellStart"/>
+      <w:proofErr w:type="gramEnd"/>
       <w:r>
         <w:rPr>
           <w:rFonts w:ascii="Courier New" w:eastAsia="Courier New" w:hAnsi="Courier New" w:cs="Courier New"/>
@@ -6599,7 +6866,27 @@
           <w:szCs w:val="20"/>
           <w:lang w:val="es-CO"/>
         </w:rPr>
-        <w:t>, Usuario] = {}</w:t>
+        <w:t xml:space="preserve">, </w:t>
+      </w:r>
+      <w:proofErr w:type="spellStart"/>
+      <w:r>
+        <w:rPr>
+          <w:rFonts w:ascii="Courier New" w:eastAsia="Courier New" w:hAnsi="Courier New" w:cs="Courier New"/>
+          <w:sz w:val="20"/>
+          <w:szCs w:val="20"/>
+          <w:lang w:val="es-CO"/>
+        </w:rPr>
+        <w:t>DispositivoIoT</w:t>
+      </w:r>
+      <w:proofErr w:type="spellEnd"/>
+      <w:r>
+        <w:rPr>
+          <w:rFonts w:ascii="Courier New" w:eastAsia="Courier New" w:hAnsi="Courier New" w:cs="Courier New"/>
+          <w:sz w:val="20"/>
+          <w:szCs w:val="20"/>
+          <w:lang w:val="es-CO"/>
+        </w:rPr>
+        <w:t>] = {}</w:t>
       </w:r>
     </w:p>
     <w:p>
@@ -6619,14 +6906,25 @@
         <w:t xml:space="preserve">        </w:t>
       </w:r>
       <w:proofErr w:type="spellStart"/>
-      <w:r>
-        <w:rPr>
-          <w:rFonts w:ascii="Courier New" w:eastAsia="Courier New" w:hAnsi="Courier New" w:cs="Courier New"/>
-          <w:sz w:val="20"/>
-          <w:szCs w:val="20"/>
-          <w:lang w:val="es-CO"/>
-        </w:rPr>
-        <w:t>self.dispositivos</w:t>
+      <w:proofErr w:type="gramStart"/>
+      <w:r>
+        <w:rPr>
+          <w:rFonts w:ascii="Courier New" w:eastAsia="Courier New" w:hAnsi="Courier New" w:cs="Courier New"/>
+          <w:sz w:val="20"/>
+          <w:szCs w:val="20"/>
+          <w:lang w:val="es-CO"/>
+        </w:rPr>
+        <w:t>self.ordenes</w:t>
+      </w:r>
+      <w:proofErr w:type="gramEnd"/>
+      <w:r>
+        <w:rPr>
+          <w:rFonts w:ascii="Courier New" w:eastAsia="Courier New" w:hAnsi="Courier New" w:cs="Courier New"/>
+          <w:sz w:val="20"/>
+          <w:szCs w:val="20"/>
+          <w:lang w:val="es-CO"/>
+        </w:rPr>
+        <w:t>_venta</w:t>
       </w:r>
       <w:proofErr w:type="spellEnd"/>
       <w:r>
@@ -6639,12 +6937,163 @@
         <w:t xml:space="preserve">: </w:t>
       </w:r>
       <w:proofErr w:type="spellStart"/>
-      <w:r>
-        <w:rPr>
-          <w:rFonts w:ascii="Courier New" w:eastAsia="Courier New" w:hAnsi="Courier New" w:cs="Courier New"/>
-          <w:sz w:val="20"/>
-          <w:szCs w:val="20"/>
-          <w:lang w:val="es-CO"/>
+      <w:proofErr w:type="gramStart"/>
+      <w:r>
+        <w:rPr>
+          <w:rFonts w:ascii="Courier New" w:eastAsia="Courier New" w:hAnsi="Courier New" w:cs="Courier New"/>
+          <w:sz w:val="20"/>
+          <w:szCs w:val="20"/>
+          <w:lang w:val="es-CO"/>
+        </w:rPr>
+        <w:t>list</w:t>
+      </w:r>
+      <w:proofErr w:type="spellEnd"/>
+      <w:r>
+        <w:rPr>
+          <w:rFonts w:ascii="Courier New" w:eastAsia="Courier New" w:hAnsi="Courier New" w:cs="Courier New"/>
+          <w:sz w:val="20"/>
+          <w:szCs w:val="20"/>
+          <w:lang w:val="es-CO"/>
+        </w:rPr>
+        <w:t>[</w:t>
+      </w:r>
+      <w:proofErr w:type="gramEnd"/>
+      <w:r>
+        <w:rPr>
+          <w:rFonts w:ascii="Courier New" w:eastAsia="Courier New" w:hAnsi="Courier New" w:cs="Courier New"/>
+          <w:sz w:val="20"/>
+          <w:szCs w:val="20"/>
+          <w:lang w:val="es-CO"/>
+        </w:rPr>
+        <w:t>Orden] = []</w:t>
+      </w:r>
+    </w:p>
+    <w:p>
+      <w:pPr>
+        <w:ind w:left="720"/>
+        <w:rPr>
+          <w:lang w:val="es-CO"/>
+        </w:rPr>
+      </w:pPr>
+      <w:r>
+        <w:rPr>
+          <w:rFonts w:ascii="Courier New" w:eastAsia="Courier New" w:hAnsi="Courier New" w:cs="Courier New"/>
+          <w:sz w:val="20"/>
+          <w:szCs w:val="20"/>
+          <w:lang w:val="es-CO"/>
+        </w:rPr>
+        <w:t xml:space="preserve">        </w:t>
+      </w:r>
+      <w:proofErr w:type="spellStart"/>
+      <w:proofErr w:type="gramStart"/>
+      <w:r>
+        <w:rPr>
+          <w:rFonts w:ascii="Courier New" w:eastAsia="Courier New" w:hAnsi="Courier New" w:cs="Courier New"/>
+          <w:sz w:val="20"/>
+          <w:szCs w:val="20"/>
+          <w:lang w:val="es-CO"/>
+        </w:rPr>
+        <w:t>self.ordenes</w:t>
+      </w:r>
+      <w:proofErr w:type="gramEnd"/>
+      <w:r>
+        <w:rPr>
+          <w:rFonts w:ascii="Courier New" w:eastAsia="Courier New" w:hAnsi="Courier New" w:cs="Courier New"/>
+          <w:sz w:val="20"/>
+          <w:szCs w:val="20"/>
+          <w:lang w:val="es-CO"/>
+        </w:rPr>
+        <w:t>_compra</w:t>
+      </w:r>
+      <w:proofErr w:type="spellEnd"/>
+      <w:r>
+        <w:rPr>
+          <w:rFonts w:ascii="Courier New" w:eastAsia="Courier New" w:hAnsi="Courier New" w:cs="Courier New"/>
+          <w:sz w:val="20"/>
+          <w:szCs w:val="20"/>
+          <w:lang w:val="es-CO"/>
+        </w:rPr>
+        <w:t xml:space="preserve">: </w:t>
+      </w:r>
+      <w:proofErr w:type="spellStart"/>
+      <w:proofErr w:type="gramStart"/>
+      <w:r>
+        <w:rPr>
+          <w:rFonts w:ascii="Courier New" w:eastAsia="Courier New" w:hAnsi="Courier New" w:cs="Courier New"/>
+          <w:sz w:val="20"/>
+          <w:szCs w:val="20"/>
+          <w:lang w:val="es-CO"/>
+        </w:rPr>
+        <w:t>list</w:t>
+      </w:r>
+      <w:proofErr w:type="spellEnd"/>
+      <w:r>
+        <w:rPr>
+          <w:rFonts w:ascii="Courier New" w:eastAsia="Courier New" w:hAnsi="Courier New" w:cs="Courier New"/>
+          <w:sz w:val="20"/>
+          <w:szCs w:val="20"/>
+          <w:lang w:val="es-CO"/>
+        </w:rPr>
+        <w:t>[</w:t>
+      </w:r>
+      <w:proofErr w:type="gramEnd"/>
+      <w:r>
+        <w:rPr>
+          <w:rFonts w:ascii="Courier New" w:eastAsia="Courier New" w:hAnsi="Courier New" w:cs="Courier New"/>
+          <w:sz w:val="20"/>
+          <w:szCs w:val="20"/>
+          <w:lang w:val="es-CO"/>
+        </w:rPr>
+        <w:t>Orden] = []</w:t>
+      </w:r>
+    </w:p>
+    <w:p>
+      <w:pPr>
+        <w:ind w:left="720"/>
+      </w:pPr>
+      <w:r>
+        <w:rPr>
+          <w:rFonts w:ascii="Courier New" w:eastAsia="Courier New" w:hAnsi="Courier New" w:cs="Courier New"/>
+          <w:sz w:val="20"/>
+          <w:szCs w:val="20"/>
+          <w:lang w:val="es-CO"/>
+        </w:rPr>
+        <w:t xml:space="preserve">        </w:t>
+      </w:r>
+      <w:proofErr w:type="spellStart"/>
+      <w:proofErr w:type="gramStart"/>
+      <w:r>
+        <w:rPr>
+          <w:rFonts w:ascii="Courier New" w:eastAsia="Courier New" w:hAnsi="Courier New" w:cs="Courier New"/>
+          <w:sz w:val="20"/>
+          <w:szCs w:val="20"/>
+        </w:rPr>
+        <w:t>self.historial</w:t>
+      </w:r>
+      <w:proofErr w:type="gramEnd"/>
+      <w:r>
+        <w:rPr>
+          <w:rFonts w:ascii="Courier New" w:eastAsia="Courier New" w:hAnsi="Courier New" w:cs="Courier New"/>
+          <w:sz w:val="20"/>
+          <w:szCs w:val="20"/>
+        </w:rPr>
+        <w:t>_transacciones</w:t>
+      </w:r>
+      <w:proofErr w:type="spellEnd"/>
+      <w:r>
+        <w:rPr>
+          <w:rFonts w:ascii="Courier New" w:eastAsia="Courier New" w:hAnsi="Courier New" w:cs="Courier New"/>
+          <w:sz w:val="20"/>
+          <w:szCs w:val="20"/>
+        </w:rPr>
+        <w:t>: list[</w:t>
+      </w:r>
+      <w:proofErr w:type="spellStart"/>
+      <w:r>
+        <w:rPr>
+          <w:rFonts w:ascii="Courier New" w:eastAsia="Courier New" w:hAnsi="Courier New" w:cs="Courier New"/>
+          <w:sz w:val="20"/>
+          <w:szCs w:val="20"/>
         </w:rPr>
         <w:t>dict</w:t>
       </w:r>
@@ -6654,262 +7103,77 @@
           <w:rFonts w:ascii="Courier New" w:eastAsia="Courier New" w:hAnsi="Courier New" w:cs="Courier New"/>
           <w:sz w:val="20"/>
           <w:szCs w:val="20"/>
-          <w:lang w:val="es-CO"/>
+        </w:rPr>
+        <w:t>] = []</w:t>
+      </w:r>
+    </w:p>
+    <w:p>
+      <w:pPr>
+        <w:ind w:left="720"/>
+      </w:pPr>
+      <w:r>
+        <w:rPr>
+          <w:rFonts w:ascii="Courier New" w:eastAsia="Courier New" w:hAnsi="Courier New" w:cs="Courier New"/>
+          <w:sz w:val="20"/>
+          <w:szCs w:val="20"/>
+        </w:rPr>
+        <w:t xml:space="preserve">        </w:t>
+      </w:r>
+      <w:proofErr w:type="spellStart"/>
+      <w:proofErr w:type="gramStart"/>
+      <w:r>
+        <w:rPr>
+          <w:rFonts w:ascii="Courier New" w:eastAsia="Courier New" w:hAnsi="Courier New" w:cs="Courier New"/>
+          <w:sz w:val="20"/>
+          <w:szCs w:val="20"/>
+        </w:rPr>
+        <w:t>self.lecturas</w:t>
+      </w:r>
+      <w:proofErr w:type="gramEnd"/>
+      <w:r>
+        <w:rPr>
+          <w:rFonts w:ascii="Courier New" w:eastAsia="Courier New" w:hAnsi="Courier New" w:cs="Courier New"/>
+          <w:sz w:val="20"/>
+          <w:szCs w:val="20"/>
+        </w:rPr>
+        <w:t>_iot</w:t>
+      </w:r>
+      <w:proofErr w:type="spellEnd"/>
+      <w:r>
+        <w:rPr>
+          <w:rFonts w:ascii="Courier New" w:eastAsia="Courier New" w:hAnsi="Courier New" w:cs="Courier New"/>
+          <w:sz w:val="20"/>
+          <w:szCs w:val="20"/>
+        </w:rPr>
+        <w:t xml:space="preserve">: </w:t>
+      </w:r>
+      <w:proofErr w:type="spellStart"/>
+      <w:proofErr w:type="gramStart"/>
+      <w:r>
+        <w:rPr>
+          <w:rFonts w:ascii="Courier New" w:eastAsia="Courier New" w:hAnsi="Courier New" w:cs="Courier New"/>
+          <w:sz w:val="20"/>
+          <w:szCs w:val="20"/>
+        </w:rPr>
+        <w:t>dict</w:t>
+      </w:r>
+      <w:proofErr w:type="spellEnd"/>
+      <w:r>
+        <w:rPr>
+          <w:rFonts w:ascii="Courier New" w:eastAsia="Courier New" w:hAnsi="Courier New" w:cs="Courier New"/>
+          <w:sz w:val="20"/>
+          <w:szCs w:val="20"/>
         </w:rPr>
         <w:t>[</w:t>
       </w:r>
-      <w:proofErr w:type="spellStart"/>
-      <w:r>
-        <w:rPr>
-          <w:rFonts w:ascii="Courier New" w:eastAsia="Courier New" w:hAnsi="Courier New" w:cs="Courier New"/>
-          <w:sz w:val="20"/>
-          <w:szCs w:val="20"/>
-          <w:lang w:val="es-CO"/>
-        </w:rPr>
-        <w:t>str</w:t>
-      </w:r>
-      <w:proofErr w:type="spellEnd"/>
-      <w:r>
-        <w:rPr>
-          <w:rFonts w:ascii="Courier New" w:eastAsia="Courier New" w:hAnsi="Courier New" w:cs="Courier New"/>
-          <w:sz w:val="20"/>
-          <w:szCs w:val="20"/>
-          <w:lang w:val="es-CO"/>
-        </w:rPr>
-        <w:t xml:space="preserve">, </w:t>
-      </w:r>
-      <w:proofErr w:type="spellStart"/>
-      <w:r>
-        <w:rPr>
-          <w:rFonts w:ascii="Courier New" w:eastAsia="Courier New" w:hAnsi="Courier New" w:cs="Courier New"/>
-          <w:sz w:val="20"/>
-          <w:szCs w:val="20"/>
-          <w:lang w:val="es-CO"/>
-        </w:rPr>
-        <w:t>DispositivoIoT</w:t>
-      </w:r>
-      <w:proofErr w:type="spellEnd"/>
-      <w:r>
-        <w:rPr>
-          <w:rFonts w:ascii="Courier New" w:eastAsia="Courier New" w:hAnsi="Courier New" w:cs="Courier New"/>
-          <w:sz w:val="20"/>
-          <w:szCs w:val="20"/>
-          <w:lang w:val="es-CO"/>
-        </w:rPr>
-        <w:t>] = {}</w:t>
-      </w:r>
-    </w:p>
-    <w:p>
-      <w:pPr>
-        <w:ind w:left="720"/>
-        <w:rPr>
-          <w:lang w:val="es-CO"/>
-        </w:rPr>
-      </w:pPr>
-      <w:r>
-        <w:rPr>
-          <w:rFonts w:ascii="Courier New" w:eastAsia="Courier New" w:hAnsi="Courier New" w:cs="Courier New"/>
-          <w:sz w:val="20"/>
-          <w:szCs w:val="20"/>
-          <w:lang w:val="es-CO"/>
-        </w:rPr>
-        <w:t xml:space="preserve">        </w:t>
-      </w:r>
-      <w:proofErr w:type="spellStart"/>
-      <w:r>
-        <w:rPr>
-          <w:rFonts w:ascii="Courier New" w:eastAsia="Courier New" w:hAnsi="Courier New" w:cs="Courier New"/>
-          <w:sz w:val="20"/>
-          <w:szCs w:val="20"/>
-          <w:lang w:val="es-CO"/>
-        </w:rPr>
-        <w:t>self.ordenes_venta</w:t>
-      </w:r>
-      <w:proofErr w:type="spellEnd"/>
-      <w:r>
-        <w:rPr>
-          <w:rFonts w:ascii="Courier New" w:eastAsia="Courier New" w:hAnsi="Courier New" w:cs="Courier New"/>
-          <w:sz w:val="20"/>
-          <w:szCs w:val="20"/>
-          <w:lang w:val="es-CO"/>
-        </w:rPr>
-        <w:t xml:space="preserve">: </w:t>
-      </w:r>
-      <w:proofErr w:type="spellStart"/>
-      <w:r>
-        <w:rPr>
-          <w:rFonts w:ascii="Courier New" w:eastAsia="Courier New" w:hAnsi="Courier New" w:cs="Courier New"/>
-          <w:sz w:val="20"/>
-          <w:szCs w:val="20"/>
-          <w:lang w:val="es-CO"/>
-        </w:rPr>
-        <w:t>list</w:t>
-      </w:r>
-      <w:proofErr w:type="spellEnd"/>
-      <w:r>
-        <w:rPr>
-          <w:rFonts w:ascii="Courier New" w:eastAsia="Courier New" w:hAnsi="Courier New" w:cs="Courier New"/>
-          <w:sz w:val="20"/>
-          <w:szCs w:val="20"/>
-          <w:lang w:val="es-CO"/>
-        </w:rPr>
-        <w:t>[Orden] = []</w:t>
-      </w:r>
-    </w:p>
-    <w:p>
-      <w:pPr>
-        <w:ind w:left="720"/>
-        <w:rPr>
-          <w:lang w:val="es-CO"/>
-        </w:rPr>
-      </w:pPr>
-      <w:r>
-        <w:rPr>
-          <w:rFonts w:ascii="Courier New" w:eastAsia="Courier New" w:hAnsi="Courier New" w:cs="Courier New"/>
-          <w:sz w:val="20"/>
-          <w:szCs w:val="20"/>
-          <w:lang w:val="es-CO"/>
-        </w:rPr>
-        <w:t xml:space="preserve">        </w:t>
-      </w:r>
-      <w:proofErr w:type="spellStart"/>
-      <w:r>
-        <w:rPr>
-          <w:rFonts w:ascii="Courier New" w:eastAsia="Courier New" w:hAnsi="Courier New" w:cs="Courier New"/>
-          <w:sz w:val="20"/>
-          <w:szCs w:val="20"/>
-          <w:lang w:val="es-CO"/>
-        </w:rPr>
-        <w:t>self.ordenes_compra</w:t>
-      </w:r>
-      <w:proofErr w:type="spellEnd"/>
-      <w:r>
-        <w:rPr>
-          <w:rFonts w:ascii="Courier New" w:eastAsia="Courier New" w:hAnsi="Courier New" w:cs="Courier New"/>
-          <w:sz w:val="20"/>
-          <w:szCs w:val="20"/>
-          <w:lang w:val="es-CO"/>
-        </w:rPr>
-        <w:t xml:space="preserve">: </w:t>
-      </w:r>
-      <w:proofErr w:type="spellStart"/>
-      <w:r>
-        <w:rPr>
-          <w:rFonts w:ascii="Courier New" w:eastAsia="Courier New" w:hAnsi="Courier New" w:cs="Courier New"/>
-          <w:sz w:val="20"/>
-          <w:szCs w:val="20"/>
-          <w:lang w:val="es-CO"/>
-        </w:rPr>
-        <w:t>list</w:t>
-      </w:r>
-      <w:proofErr w:type="spellEnd"/>
-      <w:r>
-        <w:rPr>
-          <w:rFonts w:ascii="Courier New" w:eastAsia="Courier New" w:hAnsi="Courier New" w:cs="Courier New"/>
-          <w:sz w:val="20"/>
-          <w:szCs w:val="20"/>
-          <w:lang w:val="es-CO"/>
-        </w:rPr>
-        <w:t>[Orden] = []</w:t>
-      </w:r>
-    </w:p>
-    <w:p>
-      <w:pPr>
-        <w:ind w:left="720"/>
-      </w:pPr>
-      <w:r>
-        <w:rPr>
-          <w:rFonts w:ascii="Courier New" w:eastAsia="Courier New" w:hAnsi="Courier New" w:cs="Courier New"/>
-          <w:sz w:val="20"/>
-          <w:szCs w:val="20"/>
-          <w:lang w:val="es-CO"/>
-        </w:rPr>
-        <w:t xml:space="preserve">        </w:t>
-      </w:r>
-      <w:proofErr w:type="spellStart"/>
-      <w:r>
-        <w:rPr>
-          <w:rFonts w:ascii="Courier New" w:eastAsia="Courier New" w:hAnsi="Courier New" w:cs="Courier New"/>
-          <w:sz w:val="20"/>
-          <w:szCs w:val="20"/>
-        </w:rPr>
-        <w:t>self.historial_transacciones</w:t>
-      </w:r>
-      <w:proofErr w:type="spellEnd"/>
-      <w:r>
-        <w:rPr>
-          <w:rFonts w:ascii="Courier New" w:eastAsia="Courier New" w:hAnsi="Courier New" w:cs="Courier New"/>
-          <w:sz w:val="20"/>
-          <w:szCs w:val="20"/>
-        </w:rPr>
-        <w:t>: list[</w:t>
-      </w:r>
-      <w:proofErr w:type="spellStart"/>
-      <w:r>
-        <w:rPr>
-          <w:rFonts w:ascii="Courier New" w:eastAsia="Courier New" w:hAnsi="Courier New" w:cs="Courier New"/>
-          <w:sz w:val="20"/>
-          <w:szCs w:val="20"/>
-        </w:rPr>
-        <w:t>dict</w:t>
-      </w:r>
-      <w:proofErr w:type="spellEnd"/>
-      <w:r>
-        <w:rPr>
-          <w:rFonts w:ascii="Courier New" w:eastAsia="Courier New" w:hAnsi="Courier New" w:cs="Courier New"/>
-          <w:sz w:val="20"/>
-          <w:szCs w:val="20"/>
-        </w:rPr>
-        <w:t>] = []</w:t>
-      </w:r>
-    </w:p>
-    <w:p>
-      <w:pPr>
-        <w:ind w:left="720"/>
-      </w:pPr>
-      <w:r>
-        <w:rPr>
-          <w:rFonts w:ascii="Courier New" w:eastAsia="Courier New" w:hAnsi="Courier New" w:cs="Courier New"/>
-          <w:sz w:val="20"/>
-          <w:szCs w:val="20"/>
-        </w:rPr>
-        <w:t xml:space="preserve">        </w:t>
-      </w:r>
-      <w:proofErr w:type="spellStart"/>
-      <w:r>
-        <w:rPr>
-          <w:rFonts w:ascii="Courier New" w:eastAsia="Courier New" w:hAnsi="Courier New" w:cs="Courier New"/>
-          <w:sz w:val="20"/>
-          <w:szCs w:val="20"/>
-        </w:rPr>
-        <w:t>self.lecturas_iot</w:t>
-      </w:r>
-      <w:proofErr w:type="spellEnd"/>
-      <w:r>
-        <w:rPr>
-          <w:rFonts w:ascii="Courier New" w:eastAsia="Courier New" w:hAnsi="Courier New" w:cs="Courier New"/>
-          <w:sz w:val="20"/>
-          <w:szCs w:val="20"/>
-        </w:rPr>
-        <w:t xml:space="preserve">: </w:t>
-      </w:r>
-      <w:proofErr w:type="spellStart"/>
-      <w:r>
-        <w:rPr>
-          <w:rFonts w:ascii="Courier New" w:eastAsia="Courier New" w:hAnsi="Courier New" w:cs="Courier New"/>
-          <w:sz w:val="20"/>
-          <w:szCs w:val="20"/>
-        </w:rPr>
-        <w:t>dict</w:t>
-      </w:r>
-      <w:proofErr w:type="spellEnd"/>
-      <w:r>
-        <w:rPr>
-          <w:rFonts w:ascii="Courier New" w:eastAsia="Courier New" w:hAnsi="Courier New" w:cs="Courier New"/>
-          <w:sz w:val="20"/>
-          <w:szCs w:val="20"/>
-        </w:rPr>
-        <w:t>[str, list[float]] = {}</w:t>
+      <w:proofErr w:type="gramEnd"/>
+      <w:r>
+        <w:rPr>
+          <w:rFonts w:ascii="Courier New" w:eastAsia="Courier New" w:hAnsi="Courier New" w:cs="Courier New"/>
+          <w:sz w:val="20"/>
+          <w:szCs w:val="20"/>
+        </w:rPr>
+        <w:t>str, list[float]] = {}</w:t>
       </w:r>
     </w:p>
     <w:p>
@@ -6923,9 +7187,19 @@
           <w:sz w:val="20"/>
           <w:szCs w:val="20"/>
         </w:rPr>
-        <w:t xml:space="preserve">        self._</w:t>
-      </w:r>
-      <w:proofErr w:type="spellStart"/>
+        <w:t xml:space="preserve">        </w:t>
+      </w:r>
+      <w:proofErr w:type="gramStart"/>
+      <w:r>
+        <w:rPr>
+          <w:rFonts w:ascii="Courier New" w:eastAsia="Courier New" w:hAnsi="Courier New" w:cs="Courier New"/>
+          <w:sz w:val="20"/>
+          <w:szCs w:val="20"/>
+        </w:rPr>
+        <w:t>self._</w:t>
+      </w:r>
+      <w:proofErr w:type="spellStart"/>
+      <w:proofErr w:type="gramEnd"/>
       <w:r>
         <w:rPr>
           <w:rFonts w:ascii="Courier New" w:eastAsia="Courier New" w:hAnsi="Courier New" w:cs="Courier New"/>
@@ -6944,6 +7218,7 @@
         <w:t xml:space="preserve"> = </w:t>
       </w:r>
       <w:proofErr w:type="spellStart"/>
+      <w:proofErr w:type="gramStart"/>
       <w:r>
         <w:rPr>
           <w:rFonts w:ascii="Courier New" w:eastAsia="Courier New" w:hAnsi="Courier New" w:cs="Courier New"/>
@@ -6953,6 +7228,7 @@
         <w:t>itertools.count</w:t>
       </w:r>
       <w:proofErr w:type="spellEnd"/>
+      <w:proofErr w:type="gramEnd"/>
       <w:r>
         <w:rPr>
           <w:rFonts w:ascii="Courier New" w:eastAsia="Courier New" w:hAnsi="Courier New" w:cs="Courier New"/>
@@ -7204,6 +7480,7 @@
         <w:t xml:space="preserve">). Esta clase se consume en main.py, donde se instancia una única vez como plataforma = </w:t>
       </w:r>
       <w:proofErr w:type="spellStart"/>
+      <w:proofErr w:type="gramStart"/>
       <w:r>
         <w:rPr>
           <w:lang w:val="es-CO"/>
@@ -7215,7 +7492,14 @@
         <w:rPr>
           <w:lang w:val="es-CO"/>
         </w:rPr>
-        <w:t xml:space="preserve">(), y todos los </w:t>
+        <w:t>(</w:t>
+      </w:r>
+      <w:proofErr w:type="gramEnd"/>
+      <w:r>
+        <w:rPr>
+          <w:lang w:val="es-CO"/>
+        </w:rPr>
+        <w:t xml:space="preserve">), y todos los </w:t>
       </w:r>
       <w:proofErr w:type="spellStart"/>
       <w:r>
@@ -8656,6 +8940,7 @@
         <w:t xml:space="preserve">    lectura = </w:t>
       </w:r>
       <w:proofErr w:type="spellStart"/>
+      <w:proofErr w:type="gramStart"/>
       <w:r>
         <w:rPr>
           <w:rFonts w:ascii="Courier New" w:eastAsia="Courier New" w:hAnsi="Courier New" w:cs="Courier New"/>
@@ -8666,6 +8951,7 @@
         <w:t>random.uniform</w:t>
       </w:r>
       <w:proofErr w:type="spellEnd"/>
+      <w:proofErr w:type="gramEnd"/>
       <w:r>
         <w:rPr>
           <w:rFonts w:ascii="Courier New" w:eastAsia="Courier New" w:hAnsi="Courier New" w:cs="Courier New"/>
@@ -8741,6 +9027,7 @@
         <w:t xml:space="preserve">    lectura = </w:t>
       </w:r>
       <w:proofErr w:type="spellStart"/>
+      <w:proofErr w:type="gramStart"/>
       <w:r>
         <w:rPr>
           <w:rFonts w:ascii="Courier New" w:eastAsia="Courier New" w:hAnsi="Courier New" w:cs="Courier New"/>
@@ -8751,6 +9038,7 @@
         <w:t>random.uniform</w:t>
       </w:r>
       <w:proofErr w:type="spellEnd"/>
+      <w:proofErr w:type="gramEnd"/>
       <w:r>
         <w:rPr>
           <w:rFonts w:ascii="Courier New" w:eastAsia="Courier New" w:hAnsi="Courier New" w:cs="Courier New"/>
@@ -8807,6 +9095,7 @@
         <w:t xml:space="preserve">    lectura = -</w:t>
       </w:r>
       <w:proofErr w:type="spellStart"/>
+      <w:proofErr w:type="gramStart"/>
       <w:r>
         <w:rPr>
           <w:rFonts w:ascii="Courier New" w:eastAsia="Courier New" w:hAnsi="Courier New" w:cs="Courier New"/>
@@ -8817,6 +9106,7 @@
         <w:t>random.uniform</w:t>
       </w:r>
       <w:proofErr w:type="spellEnd"/>
+      <w:proofErr w:type="gramEnd"/>
       <w:r>
         <w:rPr>
           <w:rFonts w:ascii="Courier New" w:eastAsia="Courier New" w:hAnsi="Courier New" w:cs="Courier New"/>
@@ -8900,14 +9190,28 @@
         <w:rPr>
           <w:lang w:val="es-CO"/>
         </w:rPr>
-        <w:t>generar_lectura</w:t>
-      </w:r>
-      <w:proofErr w:type="spellEnd"/>
-      <w:r>
-        <w:rPr>
-          <w:lang w:val="es-CO"/>
-        </w:rPr>
-        <w:t>(), tipo) que todo dispositivo debe cumplir.</w:t>
+        <w:t>generar_</w:t>
+      </w:r>
+      <w:proofErr w:type="gramStart"/>
+      <w:r>
+        <w:rPr>
+          <w:lang w:val="es-CO"/>
+        </w:rPr>
+        <w:t>lectura</w:t>
+      </w:r>
+      <w:proofErr w:type="spellEnd"/>
+      <w:r>
+        <w:rPr>
+          <w:lang w:val="es-CO"/>
+        </w:rPr>
+        <w:t>(</w:t>
+      </w:r>
+      <w:proofErr w:type="gramEnd"/>
+      <w:r>
+        <w:rPr>
+          <w:lang w:val="es-CO"/>
+        </w:rPr>
+        <w:t>), tipo) que todo dispositivo debe cumplir.</w:t>
       </w:r>
     </w:p>
     <w:p>
@@ -9122,14 +9426,28 @@
         <w:rPr>
           <w:lang w:val="es-CO"/>
         </w:rPr>
-        <w:t>crear_dispositivo</w:t>
-      </w:r>
-      <w:proofErr w:type="spellEnd"/>
-      <w:r>
-        <w:rPr>
-          <w:lang w:val="es-CO"/>
-        </w:rPr>
-        <w:t xml:space="preserve">(tipo, id, </w:t>
+        <w:t>crear_</w:t>
+      </w:r>
+      <w:proofErr w:type="gramStart"/>
+      <w:r>
+        <w:rPr>
+          <w:lang w:val="es-CO"/>
+        </w:rPr>
+        <w:t>dispositivo</w:t>
+      </w:r>
+      <w:proofErr w:type="spellEnd"/>
+      <w:r>
+        <w:rPr>
+          <w:lang w:val="es-CO"/>
+        </w:rPr>
+        <w:t>(</w:t>
+      </w:r>
+      <w:proofErr w:type="gramEnd"/>
+      <w:r>
+        <w:rPr>
+          <w:lang w:val="es-CO"/>
+        </w:rPr>
+        <w:t xml:space="preserve">tipo, id, </w:t>
       </w:r>
       <w:proofErr w:type="spellStart"/>
       <w:r>
@@ -9157,7 +9475,21 @@
         <w:rPr>
           <w:lang w:val="es-CO"/>
         </w:rPr>
-        <w:t xml:space="preserve"> tipo que llega, por ejemplo desde el </w:t>
+        <w:t xml:space="preserve"> tipo que llega, por </w:t>
+      </w:r>
+      <w:proofErr w:type="gramStart"/>
+      <w:r>
+        <w:rPr>
+          <w:lang w:val="es-CO"/>
+        </w:rPr>
+        <w:t>ejemplo</w:t>
+      </w:r>
+      <w:proofErr w:type="gramEnd"/>
+      <w:r>
+        <w:rPr>
+          <w:lang w:val="es-CO"/>
+        </w:rPr>
+        <w:t xml:space="preserve"> desde el </w:t>
       </w:r>
       <w:proofErr w:type="spellStart"/>
       <w:r>
@@ -9268,6 +9600,7 @@
         <w:t xml:space="preserve"> </w:t>
       </w:r>
       <w:proofErr w:type="spellStart"/>
+      <w:proofErr w:type="gramStart"/>
       <w:r>
         <w:rPr>
           <w:rFonts w:ascii="Courier New" w:eastAsia="Courier New" w:hAnsi="Courier New" w:cs="Courier New"/>
@@ -9285,7 +9618,17 @@
           <w:szCs w:val="20"/>
           <w:lang w:val="es-CO"/>
         </w:rPr>
-        <w:t>(ABC):</w:t>
+        <w:t>(</w:t>
+      </w:r>
+      <w:proofErr w:type="gramEnd"/>
+      <w:r>
+        <w:rPr>
+          <w:rFonts w:ascii="Courier New" w:eastAsia="Courier New" w:hAnsi="Courier New" w:cs="Courier New"/>
+          <w:sz w:val="20"/>
+          <w:szCs w:val="20"/>
+          <w:lang w:val="es-CO"/>
+        </w:rPr>
+        <w:t>ABC):</w:t>
       </w:r>
     </w:p>
     <w:p>
@@ -9351,7 +9694,17 @@
           <w:szCs w:val="20"/>
           <w:lang w:val="es-CO"/>
         </w:rPr>
-        <w:t>crear_dispositivo</w:t>
+        <w:t>crear_</w:t>
+      </w:r>
+      <w:proofErr w:type="gramStart"/>
+      <w:r>
+        <w:rPr>
+          <w:rFonts w:ascii="Courier New" w:eastAsia="Courier New" w:hAnsi="Courier New" w:cs="Courier New"/>
+          <w:sz w:val="20"/>
+          <w:szCs w:val="20"/>
+          <w:lang w:val="es-CO"/>
+        </w:rPr>
+        <w:t>dispositivo</w:t>
       </w:r>
       <w:proofErr w:type="spellEnd"/>
       <w:r>
@@ -9364,6 +9717,7 @@
         <w:t>(</w:t>
       </w:r>
       <w:proofErr w:type="spellStart"/>
+      <w:proofErr w:type="gramEnd"/>
       <w:r>
         <w:rPr>
           <w:rFonts w:ascii="Courier New" w:eastAsia="Courier New" w:hAnsi="Courier New" w:cs="Courier New"/>
@@ -9528,9 +9882,20 @@
           <w:szCs w:val="20"/>
           <w:lang w:val="es-CO"/>
         </w:rPr>
-        <w:t xml:space="preserve"> registrar(</w:t>
-      </w:r>
-      <w:proofErr w:type="spellStart"/>
+        <w:t xml:space="preserve"> </w:t>
+      </w:r>
+      <w:proofErr w:type="gramStart"/>
+      <w:r>
+        <w:rPr>
+          <w:rFonts w:ascii="Courier New" w:eastAsia="Courier New" w:hAnsi="Courier New" w:cs="Courier New"/>
+          <w:sz w:val="20"/>
+          <w:szCs w:val="20"/>
+          <w:lang w:val="es-CO"/>
+        </w:rPr>
+        <w:t>registrar(</w:t>
+      </w:r>
+      <w:proofErr w:type="spellStart"/>
+      <w:proofErr w:type="gramEnd"/>
       <w:r>
         <w:rPr>
           <w:rFonts w:ascii="Courier New" w:eastAsia="Courier New" w:hAnsi="Courier New" w:cs="Courier New"/>
@@ -9788,6 +10153,7 @@
         <w:t xml:space="preserve"> = </w:t>
       </w:r>
       <w:proofErr w:type="spellStart"/>
+      <w:proofErr w:type="gramStart"/>
       <w:r>
         <w:rPr>
           <w:rFonts w:ascii="Courier New" w:eastAsia="Courier New" w:hAnsi="Courier New" w:cs="Courier New"/>
@@ -9818,6 +10184,7 @@
         <w:t>self.tipo</w:t>
       </w:r>
       <w:proofErr w:type="spellEnd"/>
+      <w:proofErr w:type="gramEnd"/>
       <w:r>
         <w:rPr>
           <w:rFonts w:ascii="Courier New" w:eastAsia="Courier New" w:hAnsi="Courier New" w:cs="Courier New"/>
@@ -9906,14 +10273,35 @@
         <w:t xml:space="preserve"> </w:t>
       </w:r>
       <w:proofErr w:type="spellStart"/>
-      <w:r>
-        <w:rPr>
-          <w:rFonts w:ascii="Courier New" w:eastAsia="Courier New" w:hAnsi="Courier New" w:cs="Courier New"/>
-          <w:sz w:val="20"/>
-          <w:szCs w:val="20"/>
-          <w:lang w:val="es-CO"/>
-        </w:rPr>
-        <w:t>self.crear_dispositivo</w:t>
+      <w:proofErr w:type="gramStart"/>
+      <w:r>
+        <w:rPr>
+          <w:rFonts w:ascii="Courier New" w:eastAsia="Courier New" w:hAnsi="Courier New" w:cs="Courier New"/>
+          <w:sz w:val="20"/>
+          <w:szCs w:val="20"/>
+          <w:lang w:val="es-CO"/>
+        </w:rPr>
+        <w:t>self.crear</w:t>
+      </w:r>
+      <w:proofErr w:type="gramEnd"/>
+      <w:r>
+        <w:rPr>
+          <w:rFonts w:ascii="Courier New" w:eastAsia="Courier New" w:hAnsi="Courier New" w:cs="Courier New"/>
+          <w:sz w:val="20"/>
+          <w:szCs w:val="20"/>
+          <w:lang w:val="es-CO"/>
+        </w:rPr>
+        <w:t>_</w:t>
+      </w:r>
+      <w:proofErr w:type="gramStart"/>
+      <w:r>
+        <w:rPr>
+          <w:rFonts w:ascii="Courier New" w:eastAsia="Courier New" w:hAnsi="Courier New" w:cs="Courier New"/>
+          <w:sz w:val="20"/>
+          <w:szCs w:val="20"/>
+          <w:lang w:val="es-CO"/>
+        </w:rPr>
+        <w:t>dispositivo</w:t>
       </w:r>
       <w:proofErr w:type="spellEnd"/>
       <w:r>
@@ -9926,6 +10314,7 @@
         <w:t>(</w:t>
       </w:r>
       <w:proofErr w:type="spellStart"/>
+      <w:proofErr w:type="gramEnd"/>
       <w:r>
         <w:rPr>
           <w:rFonts w:ascii="Courier New" w:eastAsia="Courier New" w:hAnsi="Courier New" w:cs="Courier New"/>
@@ -10038,6 +10427,7 @@
         <w:t xml:space="preserve">class </w:t>
       </w:r>
       <w:proofErr w:type="spellStart"/>
+      <w:proofErr w:type="gramStart"/>
       <w:r>
         <w:rPr>
           <w:rFonts w:ascii="Courier New" w:eastAsia="Courier New" w:hAnsi="Courier New" w:cs="Courier New"/>
@@ -10056,6 +10446,7 @@
         <w:t>(</w:t>
       </w:r>
       <w:proofErr w:type="spellStart"/>
+      <w:proofErr w:type="gramEnd"/>
       <w:r>
         <w:rPr>
           <w:rFonts w:ascii="Courier New" w:eastAsia="Courier New" w:hAnsi="Courier New" w:cs="Courier New"/>
@@ -10150,7 +10541,17 @@
           <w:szCs w:val="20"/>
           <w:lang w:val="es-CO"/>
         </w:rPr>
-        <w:t>crear_dispositivo</w:t>
+        <w:t>crear_</w:t>
+      </w:r>
+      <w:proofErr w:type="gramStart"/>
+      <w:r>
+        <w:rPr>
+          <w:rFonts w:ascii="Courier New" w:eastAsia="Courier New" w:hAnsi="Courier New" w:cs="Courier New"/>
+          <w:sz w:val="20"/>
+          <w:szCs w:val="20"/>
+          <w:lang w:val="es-CO"/>
+        </w:rPr>
+        <w:t>dispositivo</w:t>
       </w:r>
       <w:proofErr w:type="spellEnd"/>
       <w:r>
@@ -10163,6 +10564,7 @@
         <w:t>(</w:t>
       </w:r>
       <w:proofErr w:type="spellStart"/>
+      <w:proofErr w:type="gramEnd"/>
       <w:r>
         <w:rPr>
           <w:rFonts w:ascii="Courier New" w:eastAsia="Courier New" w:hAnsi="Courier New" w:cs="Courier New"/>
@@ -10301,6 +10703,7 @@
         <w:t xml:space="preserve"> </w:t>
       </w:r>
       <w:proofErr w:type="spellStart"/>
+      <w:proofErr w:type="gramStart"/>
       <w:r>
         <w:rPr>
           <w:rFonts w:ascii="Courier New" w:eastAsia="Courier New" w:hAnsi="Courier New" w:cs="Courier New"/>
@@ -10321,6 +10724,7 @@
         <w:t>(</w:t>
       </w:r>
       <w:proofErr w:type="spellStart"/>
+      <w:proofErr w:type="gramEnd"/>
       <w:r>
         <w:rPr>
           <w:rFonts w:ascii="Courier New" w:eastAsia="Courier New" w:hAnsi="Courier New" w:cs="Courier New"/>
@@ -10361,6 +10765,7 @@
         <w:t xml:space="preserve">, </w:t>
       </w:r>
       <w:proofErr w:type="spellStart"/>
+      <w:proofErr w:type="gramStart"/>
       <w:r>
         <w:rPr>
           <w:rFonts w:ascii="Courier New" w:eastAsia="Courier New" w:hAnsi="Courier New" w:cs="Courier New"/>
@@ -10371,6 +10776,7 @@
         <w:t>self.tipo</w:t>
       </w:r>
       <w:proofErr w:type="spellEnd"/>
+      <w:proofErr w:type="gramEnd"/>
       <w:r>
         <w:rPr>
           <w:rFonts w:ascii="Courier New" w:eastAsia="Courier New" w:hAnsi="Courier New" w:cs="Courier New"/>
@@ -10475,14 +10881,28 @@
         <w:rPr>
           <w:lang w:val="es-CO"/>
         </w:rPr>
-        <w:t>PlataformaEnergia.conectar_dispositivo</w:t>
-      </w:r>
-      <w:proofErr w:type="spellEnd"/>
-      <w:r>
-        <w:rPr>
-          <w:lang w:val="es-CO"/>
-        </w:rPr>
-        <w:t>().</w:t>
+        <w:t>PlataformaEnergia.conectar_</w:t>
+      </w:r>
+      <w:proofErr w:type="gramStart"/>
+      <w:r>
+        <w:rPr>
+          <w:lang w:val="es-CO"/>
+        </w:rPr>
+        <w:t>dispositivo</w:t>
+      </w:r>
+      <w:proofErr w:type="spellEnd"/>
+      <w:r>
+        <w:rPr>
+          <w:lang w:val="es-CO"/>
+        </w:rPr>
+        <w:t>(</w:t>
+      </w:r>
+      <w:proofErr w:type="gramEnd"/>
+      <w:r>
+        <w:rPr>
+          <w:lang w:val="es-CO"/>
+        </w:rPr>
+        <w:t>).</w:t>
       </w:r>
     </w:p>
     <w:p>
@@ -11258,14 +11678,28 @@
         <w:rPr>
           <w:lang w:val="es-CO"/>
         </w:rPr>
-        <w:t>crear_dispositivo</w:t>
-      </w:r>
-      <w:proofErr w:type="spellEnd"/>
-      <w:r>
-        <w:rPr>
-          <w:lang w:val="es-CO"/>
-        </w:rPr>
-        <w:t xml:space="preserve">(tipo, id, </w:t>
+        <w:t>crear_</w:t>
+      </w:r>
+      <w:proofErr w:type="gramStart"/>
+      <w:r>
+        <w:rPr>
+          <w:lang w:val="es-CO"/>
+        </w:rPr>
+        <w:t>dispositivo</w:t>
+      </w:r>
+      <w:proofErr w:type="spellEnd"/>
+      <w:r>
+        <w:rPr>
+          <w:lang w:val="es-CO"/>
+        </w:rPr>
+        <w:t>(</w:t>
+      </w:r>
+      <w:proofErr w:type="gramEnd"/>
+      <w:r>
+        <w:rPr>
+          <w:lang w:val="es-CO"/>
+        </w:rPr>
+        <w:t xml:space="preserve">tipo, id, </w:t>
       </w:r>
       <w:proofErr w:type="spellStart"/>
       <w:r>
@@ -12014,7 +12448,27 @@
           <w:szCs w:val="20"/>
           <w:lang w:val="es-CO"/>
         </w:rPr>
-        <w:t xml:space="preserve">    cuerpo = recortar(texto, 160)</w:t>
+        <w:t xml:space="preserve">    cuerpo = </w:t>
+      </w:r>
+      <w:proofErr w:type="gramStart"/>
+      <w:r>
+        <w:rPr>
+          <w:rFonts w:ascii="Courier New" w:eastAsia="Courier New" w:hAnsi="Courier New" w:cs="Courier New"/>
+          <w:sz w:val="20"/>
+          <w:szCs w:val="20"/>
+          <w:lang w:val="es-CO"/>
+        </w:rPr>
+        <w:t>recortar(</w:t>
+      </w:r>
+      <w:proofErr w:type="gramEnd"/>
+      <w:r>
+        <w:rPr>
+          <w:rFonts w:ascii="Courier New" w:eastAsia="Courier New" w:hAnsi="Courier New" w:cs="Courier New"/>
+          <w:sz w:val="20"/>
+          <w:szCs w:val="20"/>
+          <w:lang w:val="es-CO"/>
+        </w:rPr>
+        <w:t>texto, 160)</w:t>
       </w:r>
     </w:p>
     <w:p>
@@ -12161,7 +12615,27 @@
           <w:szCs w:val="20"/>
           <w:lang w:val="es-CO"/>
         </w:rPr>
-        <w:t xml:space="preserve">    asunto = recortar(titulo, 40)</w:t>
+        <w:t xml:space="preserve">    asunto = </w:t>
+      </w:r>
+      <w:proofErr w:type="gramStart"/>
+      <w:r>
+        <w:rPr>
+          <w:rFonts w:ascii="Courier New" w:eastAsia="Courier New" w:hAnsi="Courier New" w:cs="Courier New"/>
+          <w:sz w:val="20"/>
+          <w:szCs w:val="20"/>
+          <w:lang w:val="es-CO"/>
+        </w:rPr>
+        <w:t>recortar(</w:t>
+      </w:r>
+      <w:proofErr w:type="gramEnd"/>
+      <w:r>
+        <w:rPr>
+          <w:rFonts w:ascii="Courier New" w:eastAsia="Courier New" w:hAnsi="Courier New" w:cs="Courier New"/>
+          <w:sz w:val="20"/>
+          <w:szCs w:val="20"/>
+          <w:lang w:val="es-CO"/>
+        </w:rPr>
+        <w:t>titulo, 40)</w:t>
       </w:r>
     </w:p>
     <w:p>
@@ -12178,7 +12652,27 @@
           <w:szCs w:val="20"/>
           <w:lang w:val="es-CO"/>
         </w:rPr>
-        <w:t xml:space="preserve">    cuerpo = recortar(texto, 120)</w:t>
+        <w:t xml:space="preserve">    cuerpo = </w:t>
+      </w:r>
+      <w:proofErr w:type="gramStart"/>
+      <w:r>
+        <w:rPr>
+          <w:rFonts w:ascii="Courier New" w:eastAsia="Courier New" w:hAnsi="Courier New" w:cs="Courier New"/>
+          <w:sz w:val="20"/>
+          <w:szCs w:val="20"/>
+          <w:lang w:val="es-CO"/>
+        </w:rPr>
+        <w:t>recortar(</w:t>
+      </w:r>
+      <w:proofErr w:type="gramEnd"/>
+      <w:r>
+        <w:rPr>
+          <w:rFonts w:ascii="Courier New" w:eastAsia="Courier New" w:hAnsi="Courier New" w:cs="Courier New"/>
+          <w:sz w:val="20"/>
+          <w:szCs w:val="20"/>
+          <w:lang w:val="es-CO"/>
+        </w:rPr>
+        <w:t>texto, 120)</w:t>
       </w:r>
     </w:p>
     <w:p>
@@ -12408,42 +12902,84 @@
         <w:rPr>
           <w:lang w:val="es-CO"/>
         </w:rPr>
-        <w:t>crear_notificador_transaccion</w:t>
-      </w:r>
-      <w:proofErr w:type="spellEnd"/>
-      <w:r>
-        <w:rPr>
-          <w:lang w:val="es-CO"/>
-        </w:rPr>
-        <w:t xml:space="preserve">(), </w:t>
-      </w:r>
-      <w:proofErr w:type="spellStart"/>
-      <w:r>
-        <w:rPr>
-          <w:lang w:val="es-CO"/>
-        </w:rPr>
-        <w:t>crear_notificador_alerta_iot</w:t>
-      </w:r>
-      <w:proofErr w:type="spellEnd"/>
-      <w:r>
-        <w:rPr>
-          <w:lang w:val="es-CO"/>
-        </w:rPr>
-        <w:t xml:space="preserve">() y </w:t>
-      </w:r>
-      <w:proofErr w:type="spellStart"/>
-      <w:r>
-        <w:rPr>
-          <w:lang w:val="es-CO"/>
-        </w:rPr>
-        <w:t>crear_formateador_reporte</w:t>
-      </w:r>
-      <w:proofErr w:type="spellEnd"/>
-      <w:r>
-        <w:rPr>
-          <w:lang w:val="es-CO"/>
-        </w:rPr>
-        <w:t>(), además de la propiedad canal. Representa a “un canal” capaz de construir su familia completa de notificadores.</w:t>
+        <w:t>crear_notificador_</w:t>
+      </w:r>
+      <w:proofErr w:type="gramStart"/>
+      <w:r>
+        <w:rPr>
+          <w:lang w:val="es-CO"/>
+        </w:rPr>
+        <w:t>transaccion</w:t>
+      </w:r>
+      <w:proofErr w:type="spellEnd"/>
+      <w:r>
+        <w:rPr>
+          <w:lang w:val="es-CO"/>
+        </w:rPr>
+        <w:t>(</w:t>
+      </w:r>
+      <w:proofErr w:type="gramEnd"/>
+      <w:r>
+        <w:rPr>
+          <w:lang w:val="es-CO"/>
+        </w:rPr>
+        <w:t xml:space="preserve">), </w:t>
+      </w:r>
+      <w:proofErr w:type="spellStart"/>
+      <w:r>
+        <w:rPr>
+          <w:lang w:val="es-CO"/>
+        </w:rPr>
+        <w:t>crear_notificador_alerta_</w:t>
+      </w:r>
+      <w:proofErr w:type="gramStart"/>
+      <w:r>
+        <w:rPr>
+          <w:lang w:val="es-CO"/>
+        </w:rPr>
+        <w:t>iot</w:t>
+      </w:r>
+      <w:proofErr w:type="spellEnd"/>
+      <w:r>
+        <w:rPr>
+          <w:lang w:val="es-CO"/>
+        </w:rPr>
+        <w:t>(</w:t>
+      </w:r>
+      <w:proofErr w:type="gramEnd"/>
+      <w:r>
+        <w:rPr>
+          <w:lang w:val="es-CO"/>
+        </w:rPr>
+        <w:t xml:space="preserve">) y </w:t>
+      </w:r>
+      <w:proofErr w:type="spellStart"/>
+      <w:r>
+        <w:rPr>
+          <w:lang w:val="es-CO"/>
+        </w:rPr>
+        <w:t>crear_formateador_</w:t>
+      </w:r>
+      <w:proofErr w:type="gramStart"/>
+      <w:r>
+        <w:rPr>
+          <w:lang w:val="es-CO"/>
+        </w:rPr>
+        <w:t>reporte</w:t>
+      </w:r>
+      <w:proofErr w:type="spellEnd"/>
+      <w:r>
+        <w:rPr>
+          <w:lang w:val="es-CO"/>
+        </w:rPr>
+        <w:t>(</w:t>
+      </w:r>
+      <w:proofErr w:type="gramEnd"/>
+      <w:r>
+        <w:rPr>
+          <w:lang w:val="es-CO"/>
+        </w:rPr>
+        <w:t>), además de la propiedad canal. Representa a “un canal” capaz de construir su familia completa de notificadores.</w:t>
       </w:r>
     </w:p>
     <w:p>
@@ -12708,6 +13244,7 @@
         <w:t xml:space="preserve">class </w:t>
       </w:r>
       <w:proofErr w:type="spellStart"/>
+      <w:proofErr w:type="gramStart"/>
       <w:r>
         <w:rPr>
           <w:rFonts w:ascii="Courier New" w:eastAsia="Courier New" w:hAnsi="Courier New" w:cs="Courier New"/>
@@ -12723,7 +13260,16 @@
           <w:sz w:val="20"/>
           <w:szCs w:val="20"/>
         </w:rPr>
-        <w:t>(ABC):</w:t>
+        <w:t>(</w:t>
+      </w:r>
+      <w:proofErr w:type="gramEnd"/>
+      <w:r>
+        <w:rPr>
+          <w:rFonts w:ascii="Courier New" w:eastAsia="Courier New" w:hAnsi="Courier New" w:cs="Courier New"/>
+          <w:sz w:val="20"/>
+          <w:szCs w:val="20"/>
+        </w:rPr>
+        <w:t>ABC):</w:t>
       </w:r>
     </w:p>
     <w:p>
@@ -13210,6 +13756,7 @@
         <w:t xml:space="preserve">class </w:t>
       </w:r>
       <w:proofErr w:type="spellStart"/>
+      <w:proofErr w:type="gramStart"/>
       <w:r>
         <w:rPr>
           <w:rFonts w:ascii="Courier New" w:eastAsia="Courier New" w:hAnsi="Courier New" w:cs="Courier New"/>
@@ -13228,6 +13775,7 @@
         <w:t>(</w:t>
       </w:r>
       <w:proofErr w:type="spellStart"/>
+      <w:proofErr w:type="gramEnd"/>
       <w:r>
         <w:rPr>
           <w:rFonts w:ascii="Courier New" w:eastAsia="Courier New" w:hAnsi="Courier New" w:cs="Courier New"/>
@@ -13479,6 +14027,7 @@
         <w:t xml:space="preserve"> _</w:t>
       </w:r>
       <w:proofErr w:type="spellStart"/>
+      <w:proofErr w:type="gramStart"/>
       <w:r>
         <w:rPr>
           <w:rFonts w:ascii="Courier New" w:eastAsia="Courier New" w:hAnsi="Courier New" w:cs="Courier New"/>
@@ -13496,7 +14045,17 @@
           <w:szCs w:val="20"/>
           <w:lang w:val="es-CO"/>
         </w:rPr>
-        <w:t>()</w:t>
+        <w:t>(</w:t>
+      </w:r>
+      <w:proofErr w:type="gramEnd"/>
+      <w:r>
+        <w:rPr>
+          <w:rFonts w:ascii="Courier New" w:eastAsia="Courier New" w:hAnsi="Courier New" w:cs="Courier New"/>
+          <w:sz w:val="20"/>
+          <w:szCs w:val="20"/>
+          <w:lang w:val="es-CO"/>
+        </w:rPr>
+        <w:t>)</w:t>
       </w:r>
     </w:p>
     <w:p>
@@ -13516,6 +14075,7 @@
         <w:t xml:space="preserve">    # ... crea también _</w:t>
       </w:r>
       <w:proofErr w:type="spellStart"/>
+      <w:proofErr w:type="gramStart"/>
       <w:r>
         <w:rPr>
           <w:rFonts w:ascii="Courier New" w:eastAsia="Courier New" w:hAnsi="Courier New" w:cs="Courier New"/>
@@ -13533,9 +14093,20 @@
           <w:szCs w:val="20"/>
           <w:lang w:val="es-CO"/>
         </w:rPr>
-        <w:t>() y _</w:t>
-      </w:r>
-      <w:proofErr w:type="spellStart"/>
+        <w:t>(</w:t>
+      </w:r>
+      <w:proofErr w:type="gramEnd"/>
+      <w:r>
+        <w:rPr>
+          <w:rFonts w:ascii="Courier New" w:eastAsia="Courier New" w:hAnsi="Courier New" w:cs="Courier New"/>
+          <w:sz w:val="20"/>
+          <w:szCs w:val="20"/>
+          <w:lang w:val="es-CO"/>
+        </w:rPr>
+        <w:t>) y _</w:t>
+      </w:r>
+      <w:proofErr w:type="spellStart"/>
+      <w:proofErr w:type="gramStart"/>
       <w:r>
         <w:rPr>
           <w:rFonts w:ascii="Courier New" w:eastAsia="Courier New" w:hAnsi="Courier New" w:cs="Courier New"/>
@@ -13553,7 +14124,17 @@
           <w:szCs w:val="20"/>
           <w:lang w:val="es-CO"/>
         </w:rPr>
-        <w:t>()</w:t>
+        <w:t>(</w:t>
+      </w:r>
+      <w:proofErr w:type="gramEnd"/>
+      <w:r>
+        <w:rPr>
+          <w:rFonts w:ascii="Courier New" w:eastAsia="Courier New" w:hAnsi="Courier New" w:cs="Courier New"/>
+          <w:sz w:val="20"/>
+          <w:szCs w:val="20"/>
+          <w:lang w:val="es-CO"/>
+        </w:rPr>
+        <w:t>)</w:t>
       </w:r>
     </w:p>
     <w:p>
@@ -14308,7 +14889,21 @@
         <w:rPr>
           <w:lang w:val="es-CO"/>
         </w:rPr>
-        <w:t>el patrón también trae un costo conocido en la literatura: agregar una familia nueva (un canal, por ejemplo WhatsApp) es barato, pero agregar un producto nuevo a la familia (por ejemplo, un cuarto tipo de aviso además de transacción/alerta/reporte) obliga a tocar las tres fábricas concretas existentes (</w:t>
+        <w:t xml:space="preserve">el patrón también trae un costo conocido en la literatura: agregar una familia nueva (un canal, por </w:t>
+      </w:r>
+      <w:proofErr w:type="gramStart"/>
+      <w:r>
+        <w:rPr>
+          <w:lang w:val="es-CO"/>
+        </w:rPr>
+        <w:t>ejemplo</w:t>
+      </w:r>
+      <w:proofErr w:type="gramEnd"/>
+      <w:r>
+        <w:rPr>
+          <w:lang w:val="es-CO"/>
+        </w:rPr>
+        <w:t xml:space="preserve"> WhatsApp) es barato, pero agregar un producto nuevo a la familia (por ejemplo, un cuarto tipo de aviso además de transacción/alerta/reporte) obliga a tocar las tres fábricas concretas existentes (</w:t>
       </w:r>
       <w:proofErr w:type="spellStart"/>
       <w:r>
@@ -14550,7 +15145,7 @@
           <w:noProof/>
         </w:rPr>
         <w:drawing>
-          <wp:anchor distT="0" distB="0" distL="114300" distR="114300" simplePos="0" relativeHeight="251658240" behindDoc="0" locked="0" layoutInCell="1" allowOverlap="1" wp14:anchorId="73810800" wp14:editId="1FB360BE">
+          <wp:anchor distT="0" distB="0" distL="114300" distR="114300" simplePos="0" relativeHeight="251658240" behindDoc="0" locked="0" layoutInCell="1" allowOverlap="1" wp14:anchorId="73810800" wp14:editId="58EFF8AF">
             <wp:simplePos x="0" y="0"/>
             <wp:positionH relativeFrom="column">
               <wp:posOffset>0</wp:posOffset>
@@ -14887,7 +15482,7 @@
           <w:lang w:val="es-CO"/>
         </w:rPr>
         <w:drawing>
-          <wp:anchor distT="0" distB="0" distL="114300" distR="114300" simplePos="0" relativeHeight="251662336" behindDoc="0" locked="0" layoutInCell="1" allowOverlap="1" wp14:anchorId="01FE50A0" wp14:editId="07CB5CCA">
+          <wp:anchor distT="0" distB="0" distL="114300" distR="114300" simplePos="0" relativeHeight="251662336" behindDoc="0" locked="0" layoutInCell="1" allowOverlap="1" wp14:anchorId="01FE50A0" wp14:editId="252A0AE0">
             <wp:simplePos x="0" y="0"/>
             <wp:positionH relativeFrom="column">
               <wp:posOffset>0</wp:posOffset>
@@ -15800,9 +16395,19 @@
           <w:sz w:val="20"/>
           <w:szCs w:val="20"/>
         </w:rPr>
-        <w:t>n".join</w:t>
-      </w:r>
-      <w:proofErr w:type="spellEnd"/>
+        <w:t>n</w:t>
+      </w:r>
+      <w:proofErr w:type="gramStart"/>
+      <w:r>
+        <w:rPr>
+          <w:rFonts w:ascii="Courier New" w:eastAsia="Courier New" w:hAnsi="Courier New" w:cs="Courier New"/>
+          <w:sz w:val="20"/>
+          <w:szCs w:val="20"/>
+        </w:rPr>
+        <w:t>".join</w:t>
+      </w:r>
+      <w:proofErr w:type="spellEnd"/>
+      <w:proofErr w:type="gramEnd"/>
       <w:r>
         <w:rPr>
           <w:rFonts w:ascii="Courier New" w:eastAsia="Courier New" w:hAnsi="Courier New" w:cs="Courier New"/>
@@ -15842,7 +16447,21 @@
         <w:rPr>
           <w:lang w:val="es-CO"/>
         </w:rPr>
-        <w:t>Esa mezcla obliga a tocar el mismo método cada vez que se agrega una sección o un formato de salida nuevo, y hace difícil garantizar que el diccionario que se envía por el canal de notificación siga teniendo las claves que este espera.</w:t>
+        <w:t xml:space="preserve">Esa mezcla obliga a tocar el mismo método cada vez que se agrega una sección o un formato de salida nuevo, y hace difícil garantizar que el diccionario que se envía por el canal de notificación siga teniendo las claves que </w:t>
+      </w:r>
+      <w:proofErr w:type="gramStart"/>
+      <w:r>
+        <w:rPr>
+          <w:lang w:val="es-CO"/>
+        </w:rPr>
+        <w:t>este espera</w:t>
+      </w:r>
+      <w:proofErr w:type="gramEnd"/>
+      <w:r>
+        <w:rPr>
+          <w:lang w:val="es-CO"/>
+        </w:rPr>
+        <w:t>.</w:t>
       </w:r>
     </w:p>
     <w:p>
@@ -15910,49 +16529,105 @@
         <w:rPr>
           <w:lang w:val="es-CO"/>
         </w:rPr>
-        <w:t xml:space="preserve"> declara los pasos de construcción —encabezado(), </w:t>
-      </w:r>
-      <w:proofErr w:type="spellStart"/>
-      <w:r>
-        <w:rPr>
-          <w:lang w:val="es-CO"/>
-        </w:rPr>
-        <w:t>balance_energetico</w:t>
-      </w:r>
-      <w:proofErr w:type="spellEnd"/>
-      <w:r>
-        <w:rPr>
-          <w:lang w:val="es-CO"/>
-        </w:rPr>
-        <w:t xml:space="preserve">(), </w:t>
-      </w:r>
-      <w:proofErr w:type="spellStart"/>
-      <w:r>
-        <w:rPr>
-          <w:lang w:val="es-CO"/>
-        </w:rPr>
-        <w:t>desglose_dispositivos</w:t>
-      </w:r>
-      <w:proofErr w:type="spellEnd"/>
-      <w:r>
-        <w:rPr>
-          <w:lang w:val="es-CO"/>
-        </w:rPr>
-        <w:t xml:space="preserve">(), </w:t>
-      </w:r>
-      <w:proofErr w:type="spellStart"/>
-      <w:r>
-        <w:rPr>
-          <w:lang w:val="es-CO"/>
-        </w:rPr>
-        <w:t>historial_transacciones</w:t>
-      </w:r>
-      <w:proofErr w:type="spellEnd"/>
-      <w:r>
-        <w:rPr>
-          <w:lang w:val="es-CO"/>
-        </w:rPr>
-        <w:t xml:space="preserve">() y </w:t>
+        <w:t xml:space="preserve"> declara los pasos de construcción —</w:t>
+      </w:r>
+      <w:proofErr w:type="gramStart"/>
+      <w:r>
+        <w:rPr>
+          <w:lang w:val="es-CO"/>
+        </w:rPr>
+        <w:t>encabezado(</w:t>
+      </w:r>
+      <w:proofErr w:type="gramEnd"/>
+      <w:r>
+        <w:rPr>
+          <w:lang w:val="es-CO"/>
+        </w:rPr>
+        <w:t xml:space="preserve">), </w:t>
+      </w:r>
+      <w:proofErr w:type="spellStart"/>
+      <w:r>
+        <w:rPr>
+          <w:lang w:val="es-CO"/>
+        </w:rPr>
+        <w:t>balance_</w:t>
+      </w:r>
+      <w:proofErr w:type="gramStart"/>
+      <w:r>
+        <w:rPr>
+          <w:lang w:val="es-CO"/>
+        </w:rPr>
+        <w:t>energetico</w:t>
+      </w:r>
+      <w:proofErr w:type="spellEnd"/>
+      <w:r>
+        <w:rPr>
+          <w:lang w:val="es-CO"/>
+        </w:rPr>
+        <w:t>(</w:t>
+      </w:r>
+      <w:proofErr w:type="gramEnd"/>
+      <w:r>
+        <w:rPr>
+          <w:lang w:val="es-CO"/>
+        </w:rPr>
+        <w:t xml:space="preserve">), </w:t>
+      </w:r>
+      <w:proofErr w:type="spellStart"/>
+      <w:r>
+        <w:rPr>
+          <w:lang w:val="es-CO"/>
+        </w:rPr>
+        <w:t>desglose_</w:t>
+      </w:r>
+      <w:proofErr w:type="gramStart"/>
+      <w:r>
+        <w:rPr>
+          <w:lang w:val="es-CO"/>
+        </w:rPr>
+        <w:t>dispositivos</w:t>
+      </w:r>
+      <w:proofErr w:type="spellEnd"/>
+      <w:r>
+        <w:rPr>
+          <w:lang w:val="es-CO"/>
+        </w:rPr>
+        <w:t>(</w:t>
+      </w:r>
+      <w:proofErr w:type="gramEnd"/>
+      <w:r>
+        <w:rPr>
+          <w:lang w:val="es-CO"/>
+        </w:rPr>
+        <w:t xml:space="preserve">), </w:t>
+      </w:r>
+      <w:proofErr w:type="spellStart"/>
+      <w:r>
+        <w:rPr>
+          <w:lang w:val="es-CO"/>
+        </w:rPr>
+        <w:t>historial_</w:t>
+      </w:r>
+      <w:proofErr w:type="gramStart"/>
+      <w:r>
+        <w:rPr>
+          <w:lang w:val="es-CO"/>
+        </w:rPr>
+        <w:t>transacciones</w:t>
+      </w:r>
+      <w:proofErr w:type="spellEnd"/>
+      <w:r>
+        <w:rPr>
+          <w:lang w:val="es-CO"/>
+        </w:rPr>
+        <w:t>(</w:t>
+      </w:r>
+      <w:proofErr w:type="gramEnd"/>
+      <w:r>
+        <w:rPr>
+          <w:lang w:val="es-CO"/>
+        </w:rPr>
+        <w:t xml:space="preserve">) y </w:t>
       </w:r>
       <w:proofErr w:type="spellStart"/>
       <w:r>
@@ -15960,28 +16635,56 @@
           <w:lang w:val="es-CO"/>
         </w:rPr>
         <w:lastRenderedPageBreak/>
-        <w:t>prediccion_consumo</w:t>
-      </w:r>
-      <w:proofErr w:type="spellEnd"/>
-      <w:r>
-        <w:rPr>
-          <w:lang w:val="es-CO"/>
-        </w:rPr>
-        <w:t xml:space="preserve">()— y un método </w:t>
-      </w:r>
-      <w:proofErr w:type="spellStart"/>
-      <w:r>
-        <w:rPr>
-          <w:lang w:val="es-CO"/>
-        </w:rPr>
-        <w:t>obtener_reporte</w:t>
-      </w:r>
-      <w:proofErr w:type="spellEnd"/>
-      <w:r>
-        <w:rPr>
-          <w:lang w:val="es-CO"/>
-        </w:rPr>
-        <w:t xml:space="preserve">() que entrega el producto terminado. Cada paso devuelve el propio </w:t>
+        <w:t>prediccion_</w:t>
+      </w:r>
+      <w:proofErr w:type="gramStart"/>
+      <w:r>
+        <w:rPr>
+          <w:lang w:val="es-CO"/>
+        </w:rPr>
+        <w:t>consumo</w:t>
+      </w:r>
+      <w:proofErr w:type="spellEnd"/>
+      <w:r>
+        <w:rPr>
+          <w:lang w:val="es-CO"/>
+        </w:rPr>
+        <w:t>(</w:t>
+      </w:r>
+      <w:proofErr w:type="gramEnd"/>
+      <w:r>
+        <w:rPr>
+          <w:lang w:val="es-CO"/>
+        </w:rPr>
+        <w:t xml:space="preserve">)— y un método </w:t>
+      </w:r>
+      <w:proofErr w:type="spellStart"/>
+      <w:r>
+        <w:rPr>
+          <w:lang w:val="es-CO"/>
+        </w:rPr>
+        <w:t>obtener_</w:t>
+      </w:r>
+      <w:proofErr w:type="gramStart"/>
+      <w:r>
+        <w:rPr>
+          <w:lang w:val="es-CO"/>
+        </w:rPr>
+        <w:t>reporte</w:t>
+      </w:r>
+      <w:proofErr w:type="spellEnd"/>
+      <w:r>
+        <w:rPr>
+          <w:lang w:val="es-CO"/>
+        </w:rPr>
+        <w:t>(</w:t>
+      </w:r>
+      <w:proofErr w:type="gramEnd"/>
+      <w:r>
+        <w:rPr>
+          <w:lang w:val="es-CO"/>
+        </w:rPr>
+        <w:t xml:space="preserve">) que entrega el producto terminado. Cada paso devuelve el propio </w:t>
       </w:r>
       <w:proofErr w:type="spellStart"/>
       <w:r>
@@ -16397,6 +17100,7 @@
         <w:t xml:space="preserve"> </w:t>
       </w:r>
       <w:proofErr w:type="spellStart"/>
+      <w:proofErr w:type="gramStart"/>
       <w:r>
         <w:rPr>
           <w:rFonts w:ascii="Courier New" w:eastAsia="Courier New" w:hAnsi="Courier New" w:cs="Courier New"/>
@@ -16414,7 +17118,17 @@
           <w:szCs w:val="20"/>
           <w:lang w:val="es-CO"/>
         </w:rPr>
-        <w:t>(ABC):</w:t>
+        <w:t>(</w:t>
+      </w:r>
+      <w:proofErr w:type="gramEnd"/>
+      <w:r>
+        <w:rPr>
+          <w:rFonts w:ascii="Courier New" w:eastAsia="Courier New" w:hAnsi="Courier New" w:cs="Courier New"/>
+          <w:sz w:val="20"/>
+          <w:szCs w:val="20"/>
+          <w:lang w:val="es-CO"/>
+        </w:rPr>
+        <w:t>ABC):</w:t>
       </w:r>
     </w:p>
     <w:p>
@@ -16468,9 +17182,20 @@
           <w:szCs w:val="20"/>
           <w:lang w:val="es-CO"/>
         </w:rPr>
-        <w:t xml:space="preserve"> encabezado(</w:t>
-      </w:r>
-      <w:proofErr w:type="spellStart"/>
+        <w:t xml:space="preserve"> </w:t>
+      </w:r>
+      <w:proofErr w:type="gramStart"/>
+      <w:r>
+        <w:rPr>
+          <w:rFonts w:ascii="Courier New" w:eastAsia="Courier New" w:hAnsi="Courier New" w:cs="Courier New"/>
+          <w:sz w:val="20"/>
+          <w:szCs w:val="20"/>
+          <w:lang w:val="es-CO"/>
+        </w:rPr>
+        <w:t>encabezado(</w:t>
+      </w:r>
+      <w:proofErr w:type="spellStart"/>
+      <w:proofErr w:type="gramEnd"/>
       <w:r>
         <w:rPr>
           <w:rFonts w:ascii="Courier New" w:eastAsia="Courier New" w:hAnsi="Courier New" w:cs="Courier New"/>
@@ -16572,7 +17297,17 @@
           <w:szCs w:val="20"/>
           <w:lang w:val="es-CO"/>
         </w:rPr>
-        <w:t>balance_energetico</w:t>
+        <w:t>balance_</w:t>
+      </w:r>
+      <w:proofErr w:type="gramStart"/>
+      <w:r>
+        <w:rPr>
+          <w:rFonts w:ascii="Courier New" w:eastAsia="Courier New" w:hAnsi="Courier New" w:cs="Courier New"/>
+          <w:sz w:val="20"/>
+          <w:szCs w:val="20"/>
+          <w:lang w:val="es-CO"/>
+        </w:rPr>
+        <w:t>energetico</w:t>
       </w:r>
       <w:proofErr w:type="spellEnd"/>
       <w:r>
@@ -16585,6 +17320,7 @@
         <w:t>(</w:t>
       </w:r>
       <w:proofErr w:type="spellStart"/>
+      <w:proofErr w:type="gramEnd"/>
       <w:r>
         <w:rPr>
           <w:rFonts w:ascii="Courier New" w:eastAsia="Courier New" w:hAnsi="Courier New" w:cs="Courier New"/>
@@ -16954,7 +17690,17 @@
           <w:szCs w:val="20"/>
           <w:lang w:val="es-CO"/>
         </w:rPr>
-        <w:t>reporte_completo</w:t>
+        <w:t>reporte_</w:t>
+      </w:r>
+      <w:proofErr w:type="gramStart"/>
+      <w:r>
+        <w:rPr>
+          <w:rFonts w:ascii="Courier New" w:eastAsia="Courier New" w:hAnsi="Courier New" w:cs="Courier New"/>
+          <w:sz w:val="20"/>
+          <w:szCs w:val="20"/>
+          <w:lang w:val="es-CO"/>
+        </w:rPr>
+        <w:t>completo</w:t>
       </w:r>
       <w:proofErr w:type="spellEnd"/>
       <w:r>
@@ -16967,6 +17713,7 @@
         <w:t>(</w:t>
       </w:r>
       <w:proofErr w:type="spellStart"/>
+      <w:proofErr w:type="gramEnd"/>
       <w:r>
         <w:rPr>
           <w:rFonts w:ascii="Courier New" w:eastAsia="Courier New" w:hAnsi="Courier New" w:cs="Courier New"/>
@@ -17024,6 +17771,7 @@
         <w:t xml:space="preserve">        b = </w:t>
       </w:r>
       <w:proofErr w:type="spellStart"/>
+      <w:proofErr w:type="gramStart"/>
       <w:r>
         <w:rPr>
           <w:rFonts w:ascii="Courier New" w:eastAsia="Courier New" w:hAnsi="Courier New" w:cs="Courier New"/>
@@ -17044,6 +17792,7 @@
         <w:t>._</w:t>
       </w:r>
       <w:proofErr w:type="spellStart"/>
+      <w:proofErr w:type="gramEnd"/>
       <w:r>
         <w:rPr>
           <w:rFonts w:ascii="Courier New" w:eastAsia="Courier New" w:hAnsi="Courier New" w:cs="Courier New"/>
@@ -17072,6 +17821,7 @@
         <w:t xml:space="preserve">        </w:t>
       </w:r>
       <w:proofErr w:type="spellStart"/>
+      <w:proofErr w:type="gramStart"/>
       <w:r>
         <w:rPr>
           <w:rFonts w:ascii="Courier New" w:eastAsia="Courier New" w:hAnsi="Courier New" w:cs="Courier New"/>
@@ -17082,6 +17832,7 @@
         <w:t>b.reiniciar</w:t>
       </w:r>
       <w:proofErr w:type="spellEnd"/>
+      <w:proofErr w:type="gramEnd"/>
       <w:r>
         <w:rPr>
           <w:rFonts w:ascii="Courier New" w:eastAsia="Courier New" w:hAnsi="Courier New" w:cs="Courier New"/>
@@ -17109,6 +17860,7 @@
         <w:t xml:space="preserve">        </w:t>
       </w:r>
       <w:proofErr w:type="spellStart"/>
+      <w:proofErr w:type="gramStart"/>
       <w:r>
         <w:rPr>
           <w:rFonts w:ascii="Courier New" w:eastAsia="Courier New" w:hAnsi="Courier New" w:cs="Courier New"/>
@@ -17119,6 +17871,7 @@
         <w:t>b.encabezado</w:t>
       </w:r>
       <w:proofErr w:type="spellEnd"/>
+      <w:proofErr w:type="gramEnd"/>
       <w:r>
         <w:rPr>
           <w:rFonts w:ascii="Courier New" w:eastAsia="Courier New" w:hAnsi="Courier New" w:cs="Courier New"/>
@@ -17129,6 +17882,7 @@
         <w:t>(</w:t>
       </w:r>
       <w:proofErr w:type="spellStart"/>
+      <w:proofErr w:type="gramStart"/>
       <w:r>
         <w:rPr>
           <w:rFonts w:ascii="Courier New" w:eastAsia="Courier New" w:hAnsi="Courier New" w:cs="Courier New"/>
@@ -17139,6 +17893,7 @@
         <w:t>datos.usuario</w:t>
       </w:r>
       <w:proofErr w:type="spellEnd"/>
+      <w:proofErr w:type="gramEnd"/>
       <w:r>
         <w:rPr>
           <w:rFonts w:ascii="Courier New" w:eastAsia="Courier New" w:hAnsi="Courier New" w:cs="Courier New"/>
@@ -17149,6 +17904,7 @@
         <w:t xml:space="preserve">, </w:t>
       </w:r>
       <w:proofErr w:type="spellStart"/>
+      <w:proofErr w:type="gramStart"/>
       <w:r>
         <w:rPr>
           <w:rFonts w:ascii="Courier New" w:eastAsia="Courier New" w:hAnsi="Courier New" w:cs="Courier New"/>
@@ -17159,6 +17915,7 @@
         <w:t>datos.periodo</w:t>
       </w:r>
       <w:proofErr w:type="spellEnd"/>
+      <w:proofErr w:type="gramEnd"/>
       <w:r>
         <w:rPr>
           <w:rFonts w:ascii="Courier New" w:eastAsia="Courier New" w:hAnsi="Courier New" w:cs="Courier New"/>
@@ -17186,14 +17943,35 @@
         <w:t xml:space="preserve">        </w:t>
       </w:r>
       <w:proofErr w:type="spellStart"/>
-      <w:r>
-        <w:rPr>
-          <w:rFonts w:ascii="Courier New" w:eastAsia="Courier New" w:hAnsi="Courier New" w:cs="Courier New"/>
-          <w:sz w:val="20"/>
-          <w:szCs w:val="20"/>
-          <w:lang w:val="es-CO"/>
-        </w:rPr>
-        <w:t>b.balance_energetico</w:t>
+      <w:proofErr w:type="gramStart"/>
+      <w:r>
+        <w:rPr>
+          <w:rFonts w:ascii="Courier New" w:eastAsia="Courier New" w:hAnsi="Courier New" w:cs="Courier New"/>
+          <w:sz w:val="20"/>
+          <w:szCs w:val="20"/>
+          <w:lang w:val="es-CO"/>
+        </w:rPr>
+        <w:t>b.balance</w:t>
+      </w:r>
+      <w:proofErr w:type="gramEnd"/>
+      <w:r>
+        <w:rPr>
+          <w:rFonts w:ascii="Courier New" w:eastAsia="Courier New" w:hAnsi="Courier New" w:cs="Courier New"/>
+          <w:sz w:val="20"/>
+          <w:szCs w:val="20"/>
+          <w:lang w:val="es-CO"/>
+        </w:rPr>
+        <w:t>_</w:t>
+      </w:r>
+      <w:proofErr w:type="gramStart"/>
+      <w:r>
+        <w:rPr>
+          <w:rFonts w:ascii="Courier New" w:eastAsia="Courier New" w:hAnsi="Courier New" w:cs="Courier New"/>
+          <w:sz w:val="20"/>
+          <w:szCs w:val="20"/>
+          <w:lang w:val="es-CO"/>
+        </w:rPr>
+        <w:t>energetico</w:t>
       </w:r>
       <w:proofErr w:type="spellEnd"/>
       <w:r>
@@ -17213,7 +17991,17 @@
           <w:szCs w:val="20"/>
           <w:lang w:val="es-CO"/>
         </w:rPr>
-        <w:t>datos.produccion_kwh</w:t>
+        <w:t>datos.produccion</w:t>
+      </w:r>
+      <w:proofErr w:type="gramEnd"/>
+      <w:r>
+        <w:rPr>
+          <w:rFonts w:ascii="Courier New" w:eastAsia="Courier New" w:hAnsi="Courier New" w:cs="Courier New"/>
+          <w:sz w:val="20"/>
+          <w:szCs w:val="20"/>
+          <w:lang w:val="es-CO"/>
+        </w:rPr>
+        <w:t>_kwh</w:t>
       </w:r>
       <w:proofErr w:type="spellEnd"/>
       <w:r>
@@ -17226,14 +18014,25 @@
         <w:t xml:space="preserve">, </w:t>
       </w:r>
       <w:proofErr w:type="spellStart"/>
-      <w:r>
-        <w:rPr>
-          <w:rFonts w:ascii="Courier New" w:eastAsia="Courier New" w:hAnsi="Courier New" w:cs="Courier New"/>
-          <w:sz w:val="20"/>
-          <w:szCs w:val="20"/>
-          <w:lang w:val="es-CO"/>
-        </w:rPr>
-        <w:t>datos.consumo_kwh</w:t>
+      <w:proofErr w:type="gramStart"/>
+      <w:r>
+        <w:rPr>
+          <w:rFonts w:ascii="Courier New" w:eastAsia="Courier New" w:hAnsi="Courier New" w:cs="Courier New"/>
+          <w:sz w:val="20"/>
+          <w:szCs w:val="20"/>
+          <w:lang w:val="es-CO"/>
+        </w:rPr>
+        <w:t>datos.consumo</w:t>
+      </w:r>
+      <w:proofErr w:type="gramEnd"/>
+      <w:r>
+        <w:rPr>
+          <w:rFonts w:ascii="Courier New" w:eastAsia="Courier New" w:hAnsi="Courier New" w:cs="Courier New"/>
+          <w:sz w:val="20"/>
+          <w:szCs w:val="20"/>
+          <w:lang w:val="es-CO"/>
+        </w:rPr>
+        <w:t>_kwh</w:t>
       </w:r>
       <w:proofErr w:type="spellEnd"/>
       <w:r>
@@ -17263,14 +18062,25 @@
         <w:t xml:space="preserve">        </w:t>
       </w:r>
       <w:proofErr w:type="spellStart"/>
-      <w:r>
-        <w:rPr>
-          <w:rFonts w:ascii="Courier New" w:eastAsia="Courier New" w:hAnsi="Courier New" w:cs="Courier New"/>
-          <w:sz w:val="20"/>
-          <w:szCs w:val="20"/>
-          <w:lang w:val="es-CO"/>
-        </w:rPr>
-        <w:t>b.desglose_dispositivos</w:t>
+      <w:proofErr w:type="gramStart"/>
+      <w:r>
+        <w:rPr>
+          <w:rFonts w:ascii="Courier New" w:eastAsia="Courier New" w:hAnsi="Courier New" w:cs="Courier New"/>
+          <w:sz w:val="20"/>
+          <w:szCs w:val="20"/>
+          <w:lang w:val="es-CO"/>
+        </w:rPr>
+        <w:t>b.desglose</w:t>
+      </w:r>
+      <w:proofErr w:type="gramEnd"/>
+      <w:r>
+        <w:rPr>
+          <w:rFonts w:ascii="Courier New" w:eastAsia="Courier New" w:hAnsi="Courier New" w:cs="Courier New"/>
+          <w:sz w:val="20"/>
+          <w:szCs w:val="20"/>
+          <w:lang w:val="es-CO"/>
+        </w:rPr>
+        <w:t>_dispositivos</w:t>
       </w:r>
       <w:proofErr w:type="spellEnd"/>
       <w:r>
@@ -17283,14 +18093,25 @@
         <w:t>(</w:t>
       </w:r>
       <w:proofErr w:type="spellStart"/>
-      <w:r>
-        <w:rPr>
-          <w:rFonts w:ascii="Courier New" w:eastAsia="Courier New" w:hAnsi="Courier New" w:cs="Courier New"/>
-          <w:sz w:val="20"/>
-          <w:szCs w:val="20"/>
-          <w:lang w:val="es-CO"/>
-        </w:rPr>
-        <w:t>datos.lecturas_por_dispositivo</w:t>
+      <w:proofErr w:type="gramStart"/>
+      <w:r>
+        <w:rPr>
+          <w:rFonts w:ascii="Courier New" w:eastAsia="Courier New" w:hAnsi="Courier New" w:cs="Courier New"/>
+          <w:sz w:val="20"/>
+          <w:szCs w:val="20"/>
+          <w:lang w:val="es-CO"/>
+        </w:rPr>
+        <w:t>datos.lecturas</w:t>
+      </w:r>
+      <w:proofErr w:type="gramEnd"/>
+      <w:r>
+        <w:rPr>
+          <w:rFonts w:ascii="Courier New" w:eastAsia="Courier New" w:hAnsi="Courier New" w:cs="Courier New"/>
+          <w:sz w:val="20"/>
+          <w:szCs w:val="20"/>
+          <w:lang w:val="es-CO"/>
+        </w:rPr>
+        <w:t>_por_dispositivo</w:t>
       </w:r>
       <w:proofErr w:type="spellEnd"/>
       <w:r>
@@ -17320,14 +18141,25 @@
         <w:t xml:space="preserve">        </w:t>
       </w:r>
       <w:proofErr w:type="spellStart"/>
-      <w:r>
-        <w:rPr>
-          <w:rFonts w:ascii="Courier New" w:eastAsia="Courier New" w:hAnsi="Courier New" w:cs="Courier New"/>
-          <w:sz w:val="20"/>
-          <w:szCs w:val="20"/>
-          <w:lang w:val="es-CO"/>
-        </w:rPr>
-        <w:t>b.historial_transacciones</w:t>
+      <w:proofErr w:type="gramStart"/>
+      <w:r>
+        <w:rPr>
+          <w:rFonts w:ascii="Courier New" w:eastAsia="Courier New" w:hAnsi="Courier New" w:cs="Courier New"/>
+          <w:sz w:val="20"/>
+          <w:szCs w:val="20"/>
+          <w:lang w:val="es-CO"/>
+        </w:rPr>
+        <w:t>b.historial</w:t>
+      </w:r>
+      <w:proofErr w:type="gramEnd"/>
+      <w:r>
+        <w:rPr>
+          <w:rFonts w:ascii="Courier New" w:eastAsia="Courier New" w:hAnsi="Courier New" w:cs="Courier New"/>
+          <w:sz w:val="20"/>
+          <w:szCs w:val="20"/>
+          <w:lang w:val="es-CO"/>
+        </w:rPr>
+        <w:t>_transacciones</w:t>
       </w:r>
       <w:proofErr w:type="spellEnd"/>
       <w:r>
@@ -17340,6 +18172,7 @@
         <w:t>(</w:t>
       </w:r>
       <w:proofErr w:type="spellStart"/>
+      <w:proofErr w:type="gramStart"/>
       <w:r>
         <w:rPr>
           <w:rFonts w:ascii="Courier New" w:eastAsia="Courier New" w:hAnsi="Courier New" w:cs="Courier New"/>
@@ -17350,6 +18183,7 @@
         <w:t>datos.transacciones</w:t>
       </w:r>
       <w:proofErr w:type="spellEnd"/>
+      <w:proofErr w:type="gramEnd"/>
       <w:r>
         <w:rPr>
           <w:rFonts w:ascii="Courier New" w:eastAsia="Courier New" w:hAnsi="Courier New" w:cs="Courier New"/>
@@ -17377,14 +18211,25 @@
         <w:t xml:space="preserve">        </w:t>
       </w:r>
       <w:proofErr w:type="spellStart"/>
-      <w:r>
-        <w:rPr>
-          <w:rFonts w:ascii="Courier New" w:eastAsia="Courier New" w:hAnsi="Courier New" w:cs="Courier New"/>
-          <w:sz w:val="20"/>
-          <w:szCs w:val="20"/>
-          <w:lang w:val="es-CO"/>
-        </w:rPr>
-        <w:t>b.prediccion_consumo</w:t>
+      <w:proofErr w:type="gramStart"/>
+      <w:r>
+        <w:rPr>
+          <w:rFonts w:ascii="Courier New" w:eastAsia="Courier New" w:hAnsi="Courier New" w:cs="Courier New"/>
+          <w:sz w:val="20"/>
+          <w:szCs w:val="20"/>
+          <w:lang w:val="es-CO"/>
+        </w:rPr>
+        <w:t>b.prediccion</w:t>
+      </w:r>
+      <w:proofErr w:type="gramEnd"/>
+      <w:r>
+        <w:rPr>
+          <w:rFonts w:ascii="Courier New" w:eastAsia="Courier New" w:hAnsi="Courier New" w:cs="Courier New"/>
+          <w:sz w:val="20"/>
+          <w:szCs w:val="20"/>
+          <w:lang w:val="es-CO"/>
+        </w:rPr>
+        <w:t>_consumo</w:t>
       </w:r>
       <w:proofErr w:type="spellEnd"/>
       <w:r>
@@ -17397,14 +18242,25 @@
         <w:t>(</w:t>
       </w:r>
       <w:proofErr w:type="spellStart"/>
-      <w:r>
-        <w:rPr>
-          <w:rFonts w:ascii="Courier New" w:eastAsia="Courier New" w:hAnsi="Courier New" w:cs="Courier New"/>
-          <w:sz w:val="20"/>
-          <w:szCs w:val="20"/>
-          <w:lang w:val="es-CO"/>
-        </w:rPr>
-        <w:t>datos.prediccion_por_dispositivo</w:t>
+      <w:proofErr w:type="gramStart"/>
+      <w:r>
+        <w:rPr>
+          <w:rFonts w:ascii="Courier New" w:eastAsia="Courier New" w:hAnsi="Courier New" w:cs="Courier New"/>
+          <w:sz w:val="20"/>
+          <w:szCs w:val="20"/>
+          <w:lang w:val="es-CO"/>
+        </w:rPr>
+        <w:t>datos.prediccion</w:t>
+      </w:r>
+      <w:proofErr w:type="gramEnd"/>
+      <w:r>
+        <w:rPr>
+          <w:rFonts w:ascii="Courier New" w:eastAsia="Courier New" w:hAnsi="Courier New" w:cs="Courier New"/>
+          <w:sz w:val="20"/>
+          <w:szCs w:val="20"/>
+          <w:lang w:val="es-CO"/>
+        </w:rPr>
+        <w:t>_por_dispositivo</w:t>
       </w:r>
       <w:proofErr w:type="spellEnd"/>
       <w:r>
@@ -17454,24 +18310,55 @@
         <w:t xml:space="preserve"> </w:t>
       </w:r>
       <w:proofErr w:type="spellStart"/>
-      <w:r>
-        <w:rPr>
-          <w:rFonts w:ascii="Courier New" w:eastAsia="Courier New" w:hAnsi="Courier New" w:cs="Courier New"/>
-          <w:sz w:val="20"/>
-          <w:szCs w:val="20"/>
-          <w:lang w:val="es-CO"/>
-        </w:rPr>
-        <w:t>b.obtener_reporte</w:t>
-      </w:r>
-      <w:proofErr w:type="spellEnd"/>
-      <w:r>
-        <w:rPr>
-          <w:rFonts w:ascii="Courier New" w:eastAsia="Courier New" w:hAnsi="Courier New" w:cs="Courier New"/>
-          <w:sz w:val="20"/>
-          <w:szCs w:val="20"/>
-          <w:lang w:val="es-CO"/>
-        </w:rPr>
-        <w:t>()</w:t>
+      <w:proofErr w:type="gramStart"/>
+      <w:r>
+        <w:rPr>
+          <w:rFonts w:ascii="Courier New" w:eastAsia="Courier New" w:hAnsi="Courier New" w:cs="Courier New"/>
+          <w:sz w:val="20"/>
+          <w:szCs w:val="20"/>
+          <w:lang w:val="es-CO"/>
+        </w:rPr>
+        <w:t>b.obtener</w:t>
+      </w:r>
+      <w:proofErr w:type="gramEnd"/>
+      <w:r>
+        <w:rPr>
+          <w:rFonts w:ascii="Courier New" w:eastAsia="Courier New" w:hAnsi="Courier New" w:cs="Courier New"/>
+          <w:sz w:val="20"/>
+          <w:szCs w:val="20"/>
+          <w:lang w:val="es-CO"/>
+        </w:rPr>
+        <w:t>_</w:t>
+      </w:r>
+      <w:proofErr w:type="gramStart"/>
+      <w:r>
+        <w:rPr>
+          <w:rFonts w:ascii="Courier New" w:eastAsia="Courier New" w:hAnsi="Courier New" w:cs="Courier New"/>
+          <w:sz w:val="20"/>
+          <w:szCs w:val="20"/>
+          <w:lang w:val="es-CO"/>
+        </w:rPr>
+        <w:t>reporte</w:t>
+      </w:r>
+      <w:proofErr w:type="spellEnd"/>
+      <w:r>
+        <w:rPr>
+          <w:rFonts w:ascii="Courier New" w:eastAsia="Courier New" w:hAnsi="Courier New" w:cs="Courier New"/>
+          <w:sz w:val="20"/>
+          <w:szCs w:val="20"/>
+          <w:lang w:val="es-CO"/>
+        </w:rPr>
+        <w:t>(</w:t>
+      </w:r>
+      <w:proofErr w:type="gramEnd"/>
+      <w:r>
+        <w:rPr>
+          <w:rFonts w:ascii="Courier New" w:eastAsia="Courier New" w:hAnsi="Courier New" w:cs="Courier New"/>
+          <w:sz w:val="20"/>
+          <w:szCs w:val="20"/>
+          <w:lang w:val="es-CO"/>
+        </w:rPr>
+        <w:t>)</w:t>
       </w:r>
     </w:p>
     <w:p>
@@ -17500,14 +18387,28 @@
         <w:rPr>
           <w:lang w:val="es-CO"/>
         </w:rPr>
-        <w:t>obtener_reporte</w:t>
-      </w:r>
-      <w:proofErr w:type="spellEnd"/>
-      <w:r>
-        <w:rPr>
-          <w:lang w:val="es-CO"/>
-        </w:rPr>
-        <w:t xml:space="preserve">() depende del </w:t>
+        <w:t>obtener_</w:t>
+      </w:r>
+      <w:proofErr w:type="gramStart"/>
+      <w:r>
+        <w:rPr>
+          <w:lang w:val="es-CO"/>
+        </w:rPr>
+        <w:t>reporte</w:t>
+      </w:r>
+      <w:proofErr w:type="spellEnd"/>
+      <w:r>
+        <w:rPr>
+          <w:lang w:val="es-CO"/>
+        </w:rPr>
+        <w:t>(</w:t>
+      </w:r>
+      <w:proofErr w:type="gramEnd"/>
+      <w:r>
+        <w:rPr>
+          <w:lang w:val="es-CO"/>
+        </w:rPr>
+        <w:t xml:space="preserve">) depende del </w:t>
       </w:r>
       <w:proofErr w:type="spellStart"/>
       <w:r>
@@ -18400,7 +19301,7 @@
           <w:noProof/>
         </w:rPr>
         <w:drawing>
-          <wp:anchor distT="0" distB="0" distL="114300" distR="114300" simplePos="0" relativeHeight="251659264" behindDoc="0" locked="0" layoutInCell="1" allowOverlap="1" wp14:anchorId="6B006350" wp14:editId="00E90E04">
+          <wp:anchor distT="0" distB="0" distL="114300" distR="114300" simplePos="0" relativeHeight="251659264" behindDoc="0" locked="0" layoutInCell="1" allowOverlap="1" wp14:anchorId="6B006350" wp14:editId="70C087E3">
             <wp:simplePos x="0" y="0"/>
             <wp:positionH relativeFrom="column">
               <wp:posOffset>-72068</wp:posOffset>
@@ -18731,7 +19632,7 @@
           <w:lang w:val="es-CO"/>
         </w:rPr>
         <w:drawing>
-          <wp:anchor distT="0" distB="0" distL="114300" distR="114300" simplePos="0" relativeHeight="251660288" behindDoc="0" locked="0" layoutInCell="1" allowOverlap="1" wp14:anchorId="7F037427" wp14:editId="68E05350">
+          <wp:anchor distT="0" distB="0" distL="114300" distR="114300" simplePos="0" relativeHeight="251660288" behindDoc="0" locked="0" layoutInCell="1" allowOverlap="1" wp14:anchorId="7F037427" wp14:editId="01032574">
             <wp:simplePos x="0" y="0"/>
             <wp:positionH relativeFrom="column">
               <wp:posOffset>0</wp:posOffset>
@@ -18970,7 +19871,7 @@
         </w:rPr>
         <w:lastRenderedPageBreak/>
         <w:drawing>
-          <wp:anchor distT="0" distB="0" distL="114300" distR="114300" simplePos="0" relativeHeight="251661312" behindDoc="0" locked="0" layoutInCell="1" allowOverlap="1" wp14:anchorId="1CEC624F" wp14:editId="0AAEA443">
+          <wp:anchor distT="0" distB="0" distL="114300" distR="114300" simplePos="0" relativeHeight="251661312" behindDoc="0" locked="0" layoutInCell="1" allowOverlap="1" wp14:anchorId="1CEC624F" wp14:editId="0ABC9DEC">
             <wp:simplePos x="0" y="0"/>
             <wp:positionH relativeFrom="column">
               <wp:posOffset>0</wp:posOffset>
@@ -19510,9 +20411,17 @@
         <w:rPr>
           <w:lang w:val="es-CO"/>
         </w:rPr>
-        <w:t>Declara el método abstracto clonar(</w:t>
-      </w:r>
-      <w:proofErr w:type="spellStart"/>
+        <w:t xml:space="preserve">Declara el método abstracto </w:t>
+      </w:r>
+      <w:proofErr w:type="gramStart"/>
+      <w:r>
+        <w:rPr>
+          <w:lang w:val="es-CO"/>
+        </w:rPr>
+        <w:t>clonar(</w:t>
+      </w:r>
+      <w:proofErr w:type="spellStart"/>
+      <w:proofErr w:type="gramEnd"/>
       <w:r>
         <w:rPr>
           <w:lang w:val="es-CO"/>
@@ -19541,32 +20450,68 @@
         <w:t xml:space="preserve">), de modo que el cliente nunca invoca el constructor de la clase concreta: siempre clona un objeto ya </w:t>
       </w:r>
       <w:proofErr w:type="spellStart"/>
-      <w:r>
-        <w:rPr>
-          <w:lang w:val="es-CO"/>
-        </w:rPr>
-        <w:t>existente.prediccion_consumo</w:t>
-      </w:r>
-      <w:proofErr w:type="spellEnd"/>
-      <w:r>
-        <w:rPr>
-          <w:lang w:val="es-CO"/>
-        </w:rPr>
-        <w:t xml:space="preserve">()— y un método </w:t>
-      </w:r>
-      <w:proofErr w:type="spellStart"/>
-      <w:r>
-        <w:rPr>
-          <w:lang w:val="es-CO"/>
-        </w:rPr>
-        <w:t>obtener_reporte</w:t>
-      </w:r>
-      <w:proofErr w:type="spellEnd"/>
-      <w:r>
-        <w:rPr>
-          <w:lang w:val="es-CO"/>
-        </w:rPr>
-        <w:t xml:space="preserve">() que entrega el producto terminado. Cada paso devuelve el propio </w:t>
+      <w:proofErr w:type="gramStart"/>
+      <w:r>
+        <w:rPr>
+          <w:lang w:val="es-CO"/>
+        </w:rPr>
+        <w:t>existente.prediccion</w:t>
+      </w:r>
+      <w:proofErr w:type="gramEnd"/>
+      <w:r>
+        <w:rPr>
+          <w:lang w:val="es-CO"/>
+        </w:rPr>
+        <w:t>_</w:t>
+      </w:r>
+      <w:proofErr w:type="gramStart"/>
+      <w:r>
+        <w:rPr>
+          <w:lang w:val="es-CO"/>
+        </w:rPr>
+        <w:t>consumo</w:t>
+      </w:r>
+      <w:proofErr w:type="spellEnd"/>
+      <w:r>
+        <w:rPr>
+          <w:lang w:val="es-CO"/>
+        </w:rPr>
+        <w:t>(</w:t>
+      </w:r>
+      <w:proofErr w:type="gramEnd"/>
+      <w:r>
+        <w:rPr>
+          <w:lang w:val="es-CO"/>
+        </w:rPr>
+        <w:t xml:space="preserve">)— y un método </w:t>
+      </w:r>
+      <w:proofErr w:type="spellStart"/>
+      <w:r>
+        <w:rPr>
+          <w:lang w:val="es-CO"/>
+        </w:rPr>
+        <w:t>obtener_</w:t>
+      </w:r>
+      <w:proofErr w:type="gramStart"/>
+      <w:r>
+        <w:rPr>
+          <w:lang w:val="es-CO"/>
+        </w:rPr>
+        <w:t>reporte</w:t>
+      </w:r>
+      <w:proofErr w:type="spellEnd"/>
+      <w:r>
+        <w:rPr>
+          <w:lang w:val="es-CO"/>
+        </w:rPr>
+        <w:t>(</w:t>
+      </w:r>
+      <w:proofErr w:type="gramEnd"/>
+      <w:r>
+        <w:rPr>
+          <w:lang w:val="es-CO"/>
+        </w:rPr>
+        <w:t xml:space="preserve">) que entrega el producto terminado. Cada paso devuelve el propio </w:t>
       </w:r>
       <w:proofErr w:type="spellStart"/>
       <w:r>
@@ -19626,9 +20571,24 @@
         <w:rPr>
           <w:lang w:val="es-CO"/>
         </w:rPr>
-        <w:t>Implementa clonar() con copia profunda (</w:t>
-      </w:r>
-      <w:proofErr w:type="spellStart"/>
+        <w:t xml:space="preserve">Implementa </w:t>
+      </w:r>
+      <w:proofErr w:type="gramStart"/>
+      <w:r>
+        <w:rPr>
+          <w:lang w:val="es-CO"/>
+        </w:rPr>
+        <w:t>clonar(</w:t>
+      </w:r>
+      <w:proofErr w:type="gramEnd"/>
+      <w:r>
+        <w:rPr>
+          <w:lang w:val="es-CO"/>
+        </w:rPr>
+        <w:t>) con copia profunda (</w:t>
+      </w:r>
+      <w:proofErr w:type="spellStart"/>
+      <w:proofErr w:type="gramStart"/>
       <w:r>
         <w:rPr>
           <w:lang w:val="es-CO"/>
@@ -19636,6 +20596,7 @@
         <w:t>copy.deepcopy</w:t>
       </w:r>
       <w:proofErr w:type="spellEnd"/>
+      <w:proofErr w:type="gramEnd"/>
       <w:r>
         <w:rPr>
           <w:lang w:val="es-CO"/>
@@ -19643,32 +20604,68 @@
         <w:t xml:space="preserve">), no superficial: conserva tipo, umbrales y notas de calibración sin compartir listas mutables por referencia entre el original y el clon, ni entre dos clones del mismo original. Admite además **cambios para ajustar campos puntuales, como un umbral distinto, sin perder el resto de la configuración </w:t>
       </w:r>
       <w:proofErr w:type="spellStart"/>
-      <w:r>
-        <w:rPr>
-          <w:lang w:val="es-CO"/>
-        </w:rPr>
-        <w:t>clonada.prediccion_consumo</w:t>
-      </w:r>
-      <w:proofErr w:type="spellEnd"/>
-      <w:r>
-        <w:rPr>
-          <w:lang w:val="es-CO"/>
-        </w:rPr>
-        <w:t xml:space="preserve">()— y un método </w:t>
-      </w:r>
-      <w:proofErr w:type="spellStart"/>
-      <w:r>
-        <w:rPr>
-          <w:lang w:val="es-CO"/>
-        </w:rPr>
-        <w:t>obtener_reporte</w:t>
-      </w:r>
-      <w:proofErr w:type="spellEnd"/>
-      <w:r>
-        <w:rPr>
-          <w:lang w:val="es-CO"/>
-        </w:rPr>
-        <w:t xml:space="preserve">() que entrega el producto terminado. Cada paso devuelve el propio </w:t>
+      <w:proofErr w:type="gramStart"/>
+      <w:r>
+        <w:rPr>
+          <w:lang w:val="es-CO"/>
+        </w:rPr>
+        <w:t>clonada.prediccion</w:t>
+      </w:r>
+      <w:proofErr w:type="gramEnd"/>
+      <w:r>
+        <w:rPr>
+          <w:lang w:val="es-CO"/>
+        </w:rPr>
+        <w:t>_</w:t>
+      </w:r>
+      <w:proofErr w:type="gramStart"/>
+      <w:r>
+        <w:rPr>
+          <w:lang w:val="es-CO"/>
+        </w:rPr>
+        <w:t>consumo</w:t>
+      </w:r>
+      <w:proofErr w:type="spellEnd"/>
+      <w:r>
+        <w:rPr>
+          <w:lang w:val="es-CO"/>
+        </w:rPr>
+        <w:t>(</w:t>
+      </w:r>
+      <w:proofErr w:type="gramEnd"/>
+      <w:r>
+        <w:rPr>
+          <w:lang w:val="es-CO"/>
+        </w:rPr>
+        <w:t xml:space="preserve">)— y un método </w:t>
+      </w:r>
+      <w:proofErr w:type="spellStart"/>
+      <w:r>
+        <w:rPr>
+          <w:lang w:val="es-CO"/>
+        </w:rPr>
+        <w:t>obtener_</w:t>
+      </w:r>
+      <w:proofErr w:type="gramStart"/>
+      <w:r>
+        <w:rPr>
+          <w:lang w:val="es-CO"/>
+        </w:rPr>
+        <w:t>reporte</w:t>
+      </w:r>
+      <w:proofErr w:type="spellEnd"/>
+      <w:r>
+        <w:rPr>
+          <w:lang w:val="es-CO"/>
+        </w:rPr>
+        <w:t>(</w:t>
+      </w:r>
+      <w:proofErr w:type="gramEnd"/>
+      <w:r>
+        <w:rPr>
+          <w:lang w:val="es-CO"/>
+        </w:rPr>
+        <w:t xml:space="preserve">) que entrega el producto terminado. Cada paso devuelve el propio </w:t>
       </w:r>
       <w:proofErr w:type="spellStart"/>
       <w:r>
@@ -19836,32 +20833,68 @@
         <w:t xml:space="preserve"> y la lista de plantillas disponibles ante un nombre </w:t>
       </w:r>
       <w:proofErr w:type="spellStart"/>
-      <w:r>
-        <w:rPr>
-          <w:lang w:val="es-CO"/>
-        </w:rPr>
-        <w:t>desconocido.prediccion_consumo</w:t>
-      </w:r>
-      <w:proofErr w:type="spellEnd"/>
-      <w:r>
-        <w:rPr>
-          <w:lang w:val="es-CO"/>
-        </w:rPr>
-        <w:t xml:space="preserve">()— y un método </w:t>
-      </w:r>
-      <w:proofErr w:type="spellStart"/>
-      <w:r>
-        <w:rPr>
-          <w:lang w:val="es-CO"/>
-        </w:rPr>
-        <w:t>obtener_reporte</w:t>
-      </w:r>
-      <w:proofErr w:type="spellEnd"/>
-      <w:r>
-        <w:rPr>
-          <w:lang w:val="es-CO"/>
-        </w:rPr>
-        <w:t xml:space="preserve">() que entrega el producto terminado. Cada paso devuelve el propio </w:t>
+      <w:proofErr w:type="gramStart"/>
+      <w:r>
+        <w:rPr>
+          <w:lang w:val="es-CO"/>
+        </w:rPr>
+        <w:t>desconocido.prediccion</w:t>
+      </w:r>
+      <w:proofErr w:type="gramEnd"/>
+      <w:r>
+        <w:rPr>
+          <w:lang w:val="es-CO"/>
+        </w:rPr>
+        <w:t>_</w:t>
+      </w:r>
+      <w:proofErr w:type="gramStart"/>
+      <w:r>
+        <w:rPr>
+          <w:lang w:val="es-CO"/>
+        </w:rPr>
+        <w:t>consumo</w:t>
+      </w:r>
+      <w:proofErr w:type="spellEnd"/>
+      <w:r>
+        <w:rPr>
+          <w:lang w:val="es-CO"/>
+        </w:rPr>
+        <w:t>(</w:t>
+      </w:r>
+      <w:proofErr w:type="gramEnd"/>
+      <w:r>
+        <w:rPr>
+          <w:lang w:val="es-CO"/>
+        </w:rPr>
+        <w:t xml:space="preserve">)— y un método </w:t>
+      </w:r>
+      <w:proofErr w:type="spellStart"/>
+      <w:r>
+        <w:rPr>
+          <w:lang w:val="es-CO"/>
+        </w:rPr>
+        <w:t>obtener_</w:t>
+      </w:r>
+      <w:proofErr w:type="gramStart"/>
+      <w:r>
+        <w:rPr>
+          <w:lang w:val="es-CO"/>
+        </w:rPr>
+        <w:t>reporte</w:t>
+      </w:r>
+      <w:proofErr w:type="spellEnd"/>
+      <w:r>
+        <w:rPr>
+          <w:lang w:val="es-CO"/>
+        </w:rPr>
+        <w:t>(</w:t>
+      </w:r>
+      <w:proofErr w:type="gramEnd"/>
+      <w:r>
+        <w:rPr>
+          <w:lang w:val="es-CO"/>
+        </w:rPr>
+        <w:t xml:space="preserve">) que entrega el producto terminado. Cada paso devuelve el propio </w:t>
       </w:r>
       <w:proofErr w:type="spellStart"/>
       <w:r>
@@ -19904,14 +20937,28 @@
         <w:rPr>
           <w:lang w:val="es-CO"/>
         </w:rPr>
-        <w:t>PlataformaEnergia.clonar_dispositivo</w:t>
-      </w:r>
-      <w:proofErr w:type="spellEnd"/>
-      <w:r>
-        <w:rPr>
-          <w:lang w:val="es-CO"/>
-        </w:rPr>
-        <w:t>() aplica la misma idea sobre el dispositivo real de la app: copia profunda del original, nueva identidad y umbrales opcionalmente ajustables, expuesto como POST /</w:t>
+        <w:t>PlataformaEnergia.clonar_</w:t>
+      </w:r>
+      <w:proofErr w:type="gramStart"/>
+      <w:r>
+        <w:rPr>
+          <w:lang w:val="es-CO"/>
+        </w:rPr>
+        <w:t>dispositivo</w:t>
+      </w:r>
+      <w:proofErr w:type="spellEnd"/>
+      <w:r>
+        <w:rPr>
+          <w:lang w:val="es-CO"/>
+        </w:rPr>
+        <w:t>(</w:t>
+      </w:r>
+      <w:proofErr w:type="gramEnd"/>
+      <w:r>
+        <w:rPr>
+          <w:lang w:val="es-CO"/>
+        </w:rPr>
+        <w:t>) aplica la misma idea sobre el dispositivo real de la app: copia profunda del original, nueva identidad y umbrales opcionalmente ajustables, expuesto como POST /</w:t>
       </w:r>
       <w:proofErr w:type="spellStart"/>
       <w:r>
@@ -19928,32 +20975,68 @@
         <w:t>/dispositivos/{id}/</w:t>
       </w:r>
       <w:proofErr w:type="spellStart"/>
-      <w:r>
-        <w:rPr>
-          <w:lang w:val="es-CO"/>
-        </w:rPr>
-        <w:t>clonar.prediccion_consumo</w:t>
-      </w:r>
-      <w:proofErr w:type="spellEnd"/>
-      <w:r>
-        <w:rPr>
-          <w:lang w:val="es-CO"/>
-        </w:rPr>
-        <w:t xml:space="preserve">()— y un método </w:t>
-      </w:r>
-      <w:proofErr w:type="spellStart"/>
-      <w:r>
-        <w:rPr>
-          <w:lang w:val="es-CO"/>
-        </w:rPr>
-        <w:t>obtener_reporte</w:t>
-      </w:r>
-      <w:proofErr w:type="spellEnd"/>
-      <w:r>
-        <w:rPr>
-          <w:lang w:val="es-CO"/>
-        </w:rPr>
-        <w:t xml:space="preserve">() que entrega el producto terminado. Cada paso devuelve el propio </w:t>
+      <w:proofErr w:type="gramStart"/>
+      <w:r>
+        <w:rPr>
+          <w:lang w:val="es-CO"/>
+        </w:rPr>
+        <w:t>clonar.prediccion</w:t>
+      </w:r>
+      <w:proofErr w:type="gramEnd"/>
+      <w:r>
+        <w:rPr>
+          <w:lang w:val="es-CO"/>
+        </w:rPr>
+        <w:t>_</w:t>
+      </w:r>
+      <w:proofErr w:type="gramStart"/>
+      <w:r>
+        <w:rPr>
+          <w:lang w:val="es-CO"/>
+        </w:rPr>
+        <w:t>consumo</w:t>
+      </w:r>
+      <w:proofErr w:type="spellEnd"/>
+      <w:r>
+        <w:rPr>
+          <w:lang w:val="es-CO"/>
+        </w:rPr>
+        <w:t>(</w:t>
+      </w:r>
+      <w:proofErr w:type="gramEnd"/>
+      <w:r>
+        <w:rPr>
+          <w:lang w:val="es-CO"/>
+        </w:rPr>
+        <w:t xml:space="preserve">)— y un método </w:t>
+      </w:r>
+      <w:proofErr w:type="spellStart"/>
+      <w:r>
+        <w:rPr>
+          <w:lang w:val="es-CO"/>
+        </w:rPr>
+        <w:t>obtener_</w:t>
+      </w:r>
+      <w:proofErr w:type="gramStart"/>
+      <w:r>
+        <w:rPr>
+          <w:lang w:val="es-CO"/>
+        </w:rPr>
+        <w:t>reporte</w:t>
+      </w:r>
+      <w:proofErr w:type="spellEnd"/>
+      <w:r>
+        <w:rPr>
+          <w:lang w:val="es-CO"/>
+        </w:rPr>
+        <w:t>(</w:t>
+      </w:r>
+      <w:proofErr w:type="gramEnd"/>
+      <w:r>
+        <w:rPr>
+          <w:lang w:val="es-CO"/>
+        </w:rPr>
+        <w:t xml:space="preserve">) que entrega el producto terminado. Cada paso devuelve el propio </w:t>
       </w:r>
       <w:proofErr w:type="spellStart"/>
       <w:r>
@@ -20000,24 +21083,42 @@
           <w:iCs/>
           <w:lang w:val="es-CO"/>
         </w:rPr>
-        <w:t xml:space="preserve">Método clonar() de </w:t>
-      </w:r>
-      <w:proofErr w:type="spellStart"/>
+        <w:t xml:space="preserve">Método </w:t>
+      </w:r>
+      <w:proofErr w:type="gramStart"/>
       <w:r>
         <w:rPr>
           <w:i/>
           <w:iCs/>
           <w:lang w:val="es-CO"/>
         </w:rPr>
-        <w:t>DispositivoIoT</w:t>
-      </w:r>
-      <w:proofErr w:type="spellEnd"/>
+        <w:t>clonar(</w:t>
+      </w:r>
+      <w:proofErr w:type="gramEnd"/>
       <w:r>
         <w:rPr>
           <w:i/>
           <w:iCs/>
           <w:lang w:val="es-CO"/>
         </w:rPr>
+        <w:t xml:space="preserve">) de </w:t>
+      </w:r>
+      <w:proofErr w:type="spellStart"/>
+      <w:r>
+        <w:rPr>
+          <w:i/>
+          <w:iCs/>
+          <w:lang w:val="es-CO"/>
+        </w:rPr>
+        <w:t>DispositivoIoT</w:t>
+      </w:r>
+      <w:proofErr w:type="spellEnd"/>
+      <w:r>
+        <w:rPr>
+          <w:i/>
+          <w:iCs/>
+          <w:lang w:val="es-CO"/>
+        </w:rPr>
         <w:t xml:space="preserve"> en prototype.py</w:t>
       </w:r>
     </w:p>
@@ -20046,9 +21147,20 @@
           <w:szCs w:val="20"/>
           <w:lang w:val="es-CO"/>
         </w:rPr>
-        <w:t xml:space="preserve"> clonar(</w:t>
-      </w:r>
-      <w:proofErr w:type="spellStart"/>
+        <w:t xml:space="preserve"> </w:t>
+      </w:r>
+      <w:proofErr w:type="gramStart"/>
+      <w:r>
+        <w:rPr>
+          <w:rFonts w:ascii="Courier New" w:eastAsia="Courier New" w:hAnsi="Courier New" w:cs="Courier New"/>
+          <w:sz w:val="20"/>
+          <w:szCs w:val="20"/>
+          <w:lang w:val="es-CO"/>
+        </w:rPr>
+        <w:t>clonar(</w:t>
+      </w:r>
+      <w:proofErr w:type="spellStart"/>
+      <w:proofErr w:type="gramEnd"/>
       <w:r>
         <w:rPr>
           <w:rFonts w:ascii="Courier New" w:eastAsia="Courier New" w:hAnsi="Courier New" w:cs="Courier New"/>
@@ -20146,6 +21258,7 @@
         <w:t xml:space="preserve">    copia = </w:t>
       </w:r>
       <w:proofErr w:type="spellStart"/>
+      <w:proofErr w:type="gramStart"/>
       <w:r>
         <w:rPr>
           <w:rFonts w:ascii="Courier New" w:eastAsia="Courier New" w:hAnsi="Courier New" w:cs="Courier New"/>
@@ -20156,6 +21269,7 @@
         <w:t>copy.deepcopy</w:t>
       </w:r>
       <w:proofErr w:type="spellEnd"/>
+      <w:proofErr w:type="gramEnd"/>
       <w:r>
         <w:rPr>
           <w:rFonts w:ascii="Courier New" w:eastAsia="Courier New" w:hAnsi="Courier New" w:cs="Courier New"/>
@@ -20290,14 +21404,25 @@
         <w:t xml:space="preserve">        </w:t>
       </w:r>
       <w:proofErr w:type="spellStart"/>
-      <w:r>
-        <w:rPr>
-          <w:rFonts w:ascii="Courier New" w:eastAsia="Courier New" w:hAnsi="Courier New" w:cs="Courier New"/>
-          <w:sz w:val="20"/>
-          <w:szCs w:val="20"/>
-          <w:lang w:val="es-CO"/>
-        </w:rPr>
-        <w:t>copia.usuario_id</w:t>
+      <w:proofErr w:type="gramStart"/>
+      <w:r>
+        <w:rPr>
+          <w:rFonts w:ascii="Courier New" w:eastAsia="Courier New" w:hAnsi="Courier New" w:cs="Courier New"/>
+          <w:sz w:val="20"/>
+          <w:szCs w:val="20"/>
+          <w:lang w:val="es-CO"/>
+        </w:rPr>
+        <w:t>copia.usuario</w:t>
+      </w:r>
+      <w:proofErr w:type="gramEnd"/>
+      <w:r>
+        <w:rPr>
+          <w:rFonts w:ascii="Courier New" w:eastAsia="Courier New" w:hAnsi="Courier New" w:cs="Courier New"/>
+          <w:sz w:val="20"/>
+          <w:szCs w:val="20"/>
+          <w:lang w:val="es-CO"/>
+        </w:rPr>
+        <w:t>_id</w:t>
       </w:r>
       <w:proofErr w:type="spellEnd"/>
       <w:r>
@@ -20358,6 +21483,7 @@
         <w:t xml:space="preserve"> campo, valor in </w:t>
       </w:r>
       <w:proofErr w:type="spellStart"/>
+      <w:proofErr w:type="gramStart"/>
       <w:r>
         <w:rPr>
           <w:rFonts w:ascii="Courier New" w:eastAsia="Courier New" w:hAnsi="Courier New" w:cs="Courier New"/>
@@ -20368,6 +21494,7 @@
         <w:t>cambios.items</w:t>
       </w:r>
       <w:proofErr w:type="spellEnd"/>
+      <w:proofErr w:type="gramEnd"/>
       <w:r>
         <w:rPr>
           <w:rFonts w:ascii="Courier New" w:eastAsia="Courier New" w:hAnsi="Courier New" w:cs="Courier New"/>
@@ -20395,6 +21522,7 @@
         <w:t xml:space="preserve">        </w:t>
       </w:r>
       <w:proofErr w:type="spellStart"/>
+      <w:proofErr w:type="gramStart"/>
       <w:r>
         <w:rPr>
           <w:rFonts w:ascii="Courier New" w:eastAsia="Courier New" w:hAnsi="Courier New" w:cs="Courier New"/>
@@ -20412,7 +21540,17 @@
           <w:szCs w:val="20"/>
           <w:lang w:val="es-CO"/>
         </w:rPr>
-        <w:t>(copia, campo, valor)</w:t>
+        <w:t>(</w:t>
+      </w:r>
+      <w:proofErr w:type="gramEnd"/>
+      <w:r>
+        <w:rPr>
+          <w:rFonts w:ascii="Courier New" w:eastAsia="Courier New" w:hAnsi="Courier New" w:cs="Courier New"/>
+          <w:sz w:val="20"/>
+          <w:szCs w:val="20"/>
+          <w:lang w:val="es-CO"/>
+        </w:rPr>
+        <w:t>copia, campo, valor)</w:t>
       </w:r>
     </w:p>
     <w:p>
@@ -21736,7 +22874,14 @@
         <w:rPr>
           <w:lang w:val="es-CO"/>
         </w:rPr>
-        <w:t>create_charge</w:t>
+        <w:t>create_</w:t>
+      </w:r>
+      <w:proofErr w:type="gramStart"/>
+      <w:r>
+        <w:rPr>
+          <w:lang w:val="es-CO"/>
+        </w:rPr>
+        <w:t>charge</w:t>
       </w:r>
       <w:proofErr w:type="spellEnd"/>
       <w:r>
@@ -21746,6 +22891,7 @@
         <w:t>(</w:t>
       </w:r>
       <w:proofErr w:type="spellStart"/>
+      <w:proofErr w:type="gramEnd"/>
       <w:r>
         <w:rPr>
           <w:lang w:val="es-CO"/>
@@ -21792,14 +22938,28 @@
         <w:rPr>
           <w:lang w:val="es-CO"/>
         </w:rPr>
-        <w:t>generar_transaccion</w:t>
-      </w:r>
-      <w:proofErr w:type="spellEnd"/>
-      <w:r>
-        <w:rPr>
-          <w:lang w:val="es-CO"/>
-        </w:rPr>
-        <w:t>(monto, moneda, referencia)).</w:t>
+        <w:t>generar_</w:t>
+      </w:r>
+      <w:proofErr w:type="gramStart"/>
+      <w:r>
+        <w:rPr>
+          <w:lang w:val="es-CO"/>
+        </w:rPr>
+        <w:t>transaccion</w:t>
+      </w:r>
+      <w:proofErr w:type="spellEnd"/>
+      <w:r>
+        <w:rPr>
+          <w:lang w:val="es-CO"/>
+        </w:rPr>
+        <w:t>(</w:t>
+      </w:r>
+      <w:proofErr w:type="gramEnd"/>
+      <w:r>
+        <w:rPr>
+          <w:lang w:val="es-CO"/>
+        </w:rPr>
+        <w:t>monto, moneda, referencia)).</w:t>
       </w:r>
     </w:p>
     <w:p>
@@ -21917,7 +23077,14 @@
         <w:rPr>
           <w:lang w:val="es-CO"/>
         </w:rPr>
-        <w:t>procesar_pago</w:t>
+        <w:t>procesar_</w:t>
+      </w:r>
+      <w:proofErr w:type="gramStart"/>
+      <w:r>
+        <w:rPr>
+          <w:lang w:val="es-CO"/>
+        </w:rPr>
+        <w:t>pago</w:t>
       </w:r>
       <w:proofErr w:type="spellEnd"/>
       <w:r>
@@ -21927,6 +23094,7 @@
         <w:t>(</w:t>
       </w:r>
       <w:proofErr w:type="spellStart"/>
+      <w:proofErr w:type="gramEnd"/>
       <w:r>
         <w:rPr>
           <w:lang w:val="es-CO"/>
@@ -21945,28 +23113,56 @@
         <w:rPr>
           <w:lang w:val="es-CO"/>
         </w:rPr>
-        <w:t>ResultadoPago.prediccion_consumo</w:t>
-      </w:r>
-      <w:proofErr w:type="spellEnd"/>
-      <w:r>
-        <w:rPr>
-          <w:lang w:val="es-CO"/>
-        </w:rPr>
-        <w:t xml:space="preserve">()— y un método </w:t>
-      </w:r>
-      <w:proofErr w:type="spellStart"/>
-      <w:r>
-        <w:rPr>
-          <w:lang w:val="es-CO"/>
-        </w:rPr>
-        <w:t>obtener_reporte</w:t>
-      </w:r>
-      <w:proofErr w:type="spellEnd"/>
-      <w:r>
-        <w:rPr>
-          <w:lang w:val="es-CO"/>
-        </w:rPr>
-        <w:t xml:space="preserve">() que entrega el producto terminado. Cada paso devuelve el propio </w:t>
+        <w:t>ResultadoPago.prediccion_</w:t>
+      </w:r>
+      <w:proofErr w:type="gramStart"/>
+      <w:r>
+        <w:rPr>
+          <w:lang w:val="es-CO"/>
+        </w:rPr>
+        <w:t>consumo</w:t>
+      </w:r>
+      <w:proofErr w:type="spellEnd"/>
+      <w:r>
+        <w:rPr>
+          <w:lang w:val="es-CO"/>
+        </w:rPr>
+        <w:t>(</w:t>
+      </w:r>
+      <w:proofErr w:type="gramEnd"/>
+      <w:r>
+        <w:rPr>
+          <w:lang w:val="es-CO"/>
+        </w:rPr>
+        <w:t xml:space="preserve">)— y un método </w:t>
+      </w:r>
+      <w:proofErr w:type="spellStart"/>
+      <w:r>
+        <w:rPr>
+          <w:lang w:val="es-CO"/>
+        </w:rPr>
+        <w:t>obtener_</w:t>
+      </w:r>
+      <w:proofErr w:type="gramStart"/>
+      <w:r>
+        <w:rPr>
+          <w:lang w:val="es-CO"/>
+        </w:rPr>
+        <w:t>reporte</w:t>
+      </w:r>
+      <w:proofErr w:type="spellEnd"/>
+      <w:r>
+        <w:rPr>
+          <w:lang w:val="es-CO"/>
+        </w:rPr>
+        <w:t>(</w:t>
+      </w:r>
+      <w:proofErr w:type="gramEnd"/>
+      <w:r>
+        <w:rPr>
+          <w:lang w:val="es-CO"/>
+        </w:rPr>
+        <w:t xml:space="preserve">) que entrega el producto terminado. Cada paso devuelve el propio </w:t>
       </w:r>
       <w:proofErr w:type="spellStart"/>
       <w:r>
@@ -22071,32 +23267,68 @@
         <w:t xml:space="preserve"> reales, con nombres de método, unidades y formatos de respuesta incompatibles entre </w:t>
       </w:r>
       <w:proofErr w:type="spellStart"/>
-      <w:r>
-        <w:rPr>
-          <w:lang w:val="es-CO"/>
-        </w:rPr>
-        <w:t>sí.prediccion_consumo</w:t>
-      </w:r>
-      <w:proofErr w:type="spellEnd"/>
-      <w:r>
-        <w:rPr>
-          <w:lang w:val="es-CO"/>
-        </w:rPr>
-        <w:t xml:space="preserve">()— y un método </w:t>
-      </w:r>
-      <w:proofErr w:type="spellStart"/>
-      <w:r>
-        <w:rPr>
-          <w:lang w:val="es-CO"/>
-        </w:rPr>
-        <w:t>obtener_reporte</w:t>
-      </w:r>
-      <w:proofErr w:type="spellEnd"/>
-      <w:r>
-        <w:rPr>
-          <w:lang w:val="es-CO"/>
-        </w:rPr>
-        <w:t xml:space="preserve">() que entrega el producto terminado. Cada paso devuelve el propio </w:t>
+      <w:proofErr w:type="gramStart"/>
+      <w:r>
+        <w:rPr>
+          <w:lang w:val="es-CO"/>
+        </w:rPr>
+        <w:t>sí.prediccion</w:t>
+      </w:r>
+      <w:proofErr w:type="gramEnd"/>
+      <w:r>
+        <w:rPr>
+          <w:lang w:val="es-CO"/>
+        </w:rPr>
+        <w:t>_</w:t>
+      </w:r>
+      <w:proofErr w:type="gramStart"/>
+      <w:r>
+        <w:rPr>
+          <w:lang w:val="es-CO"/>
+        </w:rPr>
+        <w:t>consumo</w:t>
+      </w:r>
+      <w:proofErr w:type="spellEnd"/>
+      <w:r>
+        <w:rPr>
+          <w:lang w:val="es-CO"/>
+        </w:rPr>
+        <w:t>(</w:t>
+      </w:r>
+      <w:proofErr w:type="gramEnd"/>
+      <w:r>
+        <w:rPr>
+          <w:lang w:val="es-CO"/>
+        </w:rPr>
+        <w:t xml:space="preserve">)— y un método </w:t>
+      </w:r>
+      <w:proofErr w:type="spellStart"/>
+      <w:r>
+        <w:rPr>
+          <w:lang w:val="es-CO"/>
+        </w:rPr>
+        <w:t>obtener_</w:t>
+      </w:r>
+      <w:proofErr w:type="gramStart"/>
+      <w:r>
+        <w:rPr>
+          <w:lang w:val="es-CO"/>
+        </w:rPr>
+        <w:t>reporte</w:t>
+      </w:r>
+      <w:proofErr w:type="spellEnd"/>
+      <w:r>
+        <w:rPr>
+          <w:lang w:val="es-CO"/>
+        </w:rPr>
+        <w:t>(</w:t>
+      </w:r>
+      <w:proofErr w:type="gramEnd"/>
+      <w:r>
+        <w:rPr>
+          <w:lang w:val="es-CO"/>
+        </w:rPr>
+        <w:t xml:space="preserve">) que entrega el producto terminado. Cada paso devuelve el propio </w:t>
       </w:r>
       <w:proofErr w:type="spellStart"/>
       <w:r>
@@ -22229,32 +23461,68 @@
         <w:t xml:space="preserve">), y traducen la respuesta de vuelta a ResultadoPago, el mismo objeto de valor sin importar la </w:t>
       </w:r>
       <w:proofErr w:type="spellStart"/>
-      <w:r>
-        <w:rPr>
-          <w:lang w:val="es-CO"/>
-        </w:rPr>
-        <w:t>pasarela.prediccion_consumo</w:t>
-      </w:r>
-      <w:proofErr w:type="spellEnd"/>
-      <w:r>
-        <w:rPr>
-          <w:lang w:val="es-CO"/>
-        </w:rPr>
-        <w:t xml:space="preserve">()— y un método </w:t>
-      </w:r>
-      <w:proofErr w:type="spellStart"/>
-      <w:r>
-        <w:rPr>
-          <w:lang w:val="es-CO"/>
-        </w:rPr>
-        <w:t>obtener_reporte</w:t>
-      </w:r>
-      <w:proofErr w:type="spellEnd"/>
-      <w:r>
-        <w:rPr>
-          <w:lang w:val="es-CO"/>
-        </w:rPr>
-        <w:t xml:space="preserve">() que entrega el producto terminado. Cada paso devuelve el propio </w:t>
+      <w:proofErr w:type="gramStart"/>
+      <w:r>
+        <w:rPr>
+          <w:lang w:val="es-CO"/>
+        </w:rPr>
+        <w:t>pasarela.prediccion</w:t>
+      </w:r>
+      <w:proofErr w:type="gramEnd"/>
+      <w:r>
+        <w:rPr>
+          <w:lang w:val="es-CO"/>
+        </w:rPr>
+        <w:t>_</w:t>
+      </w:r>
+      <w:proofErr w:type="gramStart"/>
+      <w:r>
+        <w:rPr>
+          <w:lang w:val="es-CO"/>
+        </w:rPr>
+        <w:t>consumo</w:t>
+      </w:r>
+      <w:proofErr w:type="spellEnd"/>
+      <w:r>
+        <w:rPr>
+          <w:lang w:val="es-CO"/>
+        </w:rPr>
+        <w:t>(</w:t>
+      </w:r>
+      <w:proofErr w:type="gramEnd"/>
+      <w:r>
+        <w:rPr>
+          <w:lang w:val="es-CO"/>
+        </w:rPr>
+        <w:t xml:space="preserve">)— y un método </w:t>
+      </w:r>
+      <w:proofErr w:type="spellStart"/>
+      <w:r>
+        <w:rPr>
+          <w:lang w:val="es-CO"/>
+        </w:rPr>
+        <w:t>obtener_</w:t>
+      </w:r>
+      <w:proofErr w:type="gramStart"/>
+      <w:r>
+        <w:rPr>
+          <w:lang w:val="es-CO"/>
+        </w:rPr>
+        <w:t>reporte</w:t>
+      </w:r>
+      <w:proofErr w:type="spellEnd"/>
+      <w:r>
+        <w:rPr>
+          <w:lang w:val="es-CO"/>
+        </w:rPr>
+        <w:t>(</w:t>
+      </w:r>
+      <w:proofErr w:type="gramEnd"/>
+      <w:r>
+        <w:rPr>
+          <w:lang w:val="es-CO"/>
+        </w:rPr>
+        <w:t xml:space="preserve">) que entrega el producto terminado. Cada paso devuelve el propio </w:t>
       </w:r>
       <w:proofErr w:type="spellStart"/>
       <w:r>
@@ -22392,32 +23660,68 @@
         <w:t xml:space="preserve"> con las disponibles ante un nombre </w:t>
       </w:r>
       <w:proofErr w:type="spellStart"/>
-      <w:r>
-        <w:rPr>
-          <w:lang w:val="es-CO"/>
-        </w:rPr>
-        <w:t>desconocido.prediccion_consumo</w:t>
-      </w:r>
-      <w:proofErr w:type="spellEnd"/>
-      <w:r>
-        <w:rPr>
-          <w:lang w:val="es-CO"/>
-        </w:rPr>
-        <w:t xml:space="preserve">()— y un método </w:t>
-      </w:r>
-      <w:proofErr w:type="spellStart"/>
-      <w:r>
-        <w:rPr>
-          <w:lang w:val="es-CO"/>
-        </w:rPr>
-        <w:t>obtener_reporte</w:t>
-      </w:r>
-      <w:proofErr w:type="spellEnd"/>
-      <w:r>
-        <w:rPr>
-          <w:lang w:val="es-CO"/>
-        </w:rPr>
-        <w:t xml:space="preserve">() que entrega el producto terminado. Cada paso devuelve el propio </w:t>
+      <w:proofErr w:type="gramStart"/>
+      <w:r>
+        <w:rPr>
+          <w:lang w:val="es-CO"/>
+        </w:rPr>
+        <w:t>desconocido.prediccion</w:t>
+      </w:r>
+      <w:proofErr w:type="gramEnd"/>
+      <w:r>
+        <w:rPr>
+          <w:lang w:val="es-CO"/>
+        </w:rPr>
+        <w:t>_</w:t>
+      </w:r>
+      <w:proofErr w:type="gramStart"/>
+      <w:r>
+        <w:rPr>
+          <w:lang w:val="es-CO"/>
+        </w:rPr>
+        <w:t>consumo</w:t>
+      </w:r>
+      <w:proofErr w:type="spellEnd"/>
+      <w:r>
+        <w:rPr>
+          <w:lang w:val="es-CO"/>
+        </w:rPr>
+        <w:t>(</w:t>
+      </w:r>
+      <w:proofErr w:type="gramEnd"/>
+      <w:r>
+        <w:rPr>
+          <w:lang w:val="es-CO"/>
+        </w:rPr>
+        <w:t xml:space="preserve">)— y un método </w:t>
+      </w:r>
+      <w:proofErr w:type="spellStart"/>
+      <w:r>
+        <w:rPr>
+          <w:lang w:val="es-CO"/>
+        </w:rPr>
+        <w:t>obtener_</w:t>
+      </w:r>
+      <w:proofErr w:type="gramStart"/>
+      <w:r>
+        <w:rPr>
+          <w:lang w:val="es-CO"/>
+        </w:rPr>
+        <w:t>reporte</w:t>
+      </w:r>
+      <w:proofErr w:type="spellEnd"/>
+      <w:r>
+        <w:rPr>
+          <w:lang w:val="es-CO"/>
+        </w:rPr>
+        <w:t>(</w:t>
+      </w:r>
+      <w:proofErr w:type="gramEnd"/>
+      <w:r>
+        <w:rPr>
+          <w:lang w:val="es-CO"/>
+        </w:rPr>
+        <w:t xml:space="preserve">) que entrega el producto terminado. Cada paso devuelve el propio </w:t>
       </w:r>
       <w:proofErr w:type="spellStart"/>
       <w:r>
@@ -22456,6 +23760,7 @@
         <w:t xml:space="preserve">Uso real en la plataforma. </w:t>
       </w:r>
       <w:proofErr w:type="spellStart"/>
+      <w:proofErr w:type="gramStart"/>
       <w:r>
         <w:rPr>
           <w:lang w:val="es-CO"/>
@@ -22470,46 +23775,97 @@
         <w:t>._</w:t>
       </w:r>
       <w:proofErr w:type="spellStart"/>
-      <w:r>
-        <w:rPr>
-          <w:lang w:val="es-CO"/>
-        </w:rPr>
-        <w:t>cobrar_transaccion</w:t>
-      </w:r>
-      <w:proofErr w:type="spellEnd"/>
-      <w:r>
-        <w:rPr>
-          <w:lang w:val="es-CO"/>
-        </w:rPr>
-        <w:t>() cobra el total de cada transacción cerrada al comprador usando SU pasarela preferida, expuesto como PUT /usuarios/me/pasarela y GET /</w:t>
-      </w:r>
-      <w:proofErr w:type="spellStart"/>
-      <w:r>
-        <w:rPr>
-          <w:lang w:val="es-CO"/>
-        </w:rPr>
-        <w:t>pagos.prediccion_consumo</w:t>
-      </w:r>
-      <w:proofErr w:type="spellEnd"/>
-      <w:r>
-        <w:rPr>
-          <w:lang w:val="es-CO"/>
-        </w:rPr>
-        <w:t xml:space="preserve">()— y un método </w:t>
-      </w:r>
-      <w:proofErr w:type="spellStart"/>
-      <w:r>
-        <w:rPr>
-          <w:lang w:val="es-CO"/>
-        </w:rPr>
-        <w:t>obtener_reporte</w:t>
-      </w:r>
-      <w:proofErr w:type="spellEnd"/>
-      <w:r>
-        <w:rPr>
-          <w:lang w:val="es-CO"/>
-        </w:rPr>
-        <w:t xml:space="preserve">() que entrega el producto terminado. Cada paso devuelve el propio </w:t>
+      <w:proofErr w:type="gramEnd"/>
+      <w:r>
+        <w:rPr>
+          <w:lang w:val="es-CO"/>
+        </w:rPr>
+        <w:t>cobrar_</w:t>
+      </w:r>
+      <w:proofErr w:type="gramStart"/>
+      <w:r>
+        <w:rPr>
+          <w:lang w:val="es-CO"/>
+        </w:rPr>
+        <w:t>transaccion</w:t>
+      </w:r>
+      <w:proofErr w:type="spellEnd"/>
+      <w:r>
+        <w:rPr>
+          <w:lang w:val="es-CO"/>
+        </w:rPr>
+        <w:t>(</w:t>
+      </w:r>
+      <w:proofErr w:type="gramEnd"/>
+      <w:r>
+        <w:rPr>
+          <w:lang w:val="es-CO"/>
+        </w:rPr>
+        <w:t>) cobra el total de cada transacción cerrada al comprador usando SU pasarela preferida, expuesto como PUT /usuarios/me/pasarela y GET /</w:t>
+      </w:r>
+      <w:proofErr w:type="spellStart"/>
+      <w:proofErr w:type="gramStart"/>
+      <w:r>
+        <w:rPr>
+          <w:lang w:val="es-CO"/>
+        </w:rPr>
+        <w:t>pagos.prediccion</w:t>
+      </w:r>
+      <w:proofErr w:type="gramEnd"/>
+      <w:r>
+        <w:rPr>
+          <w:lang w:val="es-CO"/>
+        </w:rPr>
+        <w:t>_</w:t>
+      </w:r>
+      <w:proofErr w:type="gramStart"/>
+      <w:r>
+        <w:rPr>
+          <w:lang w:val="es-CO"/>
+        </w:rPr>
+        <w:t>consumo</w:t>
+      </w:r>
+      <w:proofErr w:type="spellEnd"/>
+      <w:r>
+        <w:rPr>
+          <w:lang w:val="es-CO"/>
+        </w:rPr>
+        <w:t>(</w:t>
+      </w:r>
+      <w:proofErr w:type="gramEnd"/>
+      <w:r>
+        <w:rPr>
+          <w:lang w:val="es-CO"/>
+        </w:rPr>
+        <w:t xml:space="preserve">)— y un método </w:t>
+      </w:r>
+      <w:proofErr w:type="spellStart"/>
+      <w:r>
+        <w:rPr>
+          <w:lang w:val="es-CO"/>
+        </w:rPr>
+        <w:t>obtener_</w:t>
+      </w:r>
+      <w:proofErr w:type="gramStart"/>
+      <w:r>
+        <w:rPr>
+          <w:lang w:val="es-CO"/>
+        </w:rPr>
+        <w:t>reporte</w:t>
+      </w:r>
+      <w:proofErr w:type="spellEnd"/>
+      <w:r>
+        <w:rPr>
+          <w:lang w:val="es-CO"/>
+        </w:rPr>
+        <w:t>(</w:t>
+      </w:r>
+      <w:proofErr w:type="gramEnd"/>
+      <w:r>
+        <w:rPr>
+          <w:lang w:val="es-CO"/>
+        </w:rPr>
+        <w:t xml:space="preserve">) que entrega el producto terminado. Cada paso devuelve el propio </w:t>
       </w:r>
       <w:proofErr w:type="spellStart"/>
       <w:r>
@@ -22651,6 +24007,7 @@
         <w:t xml:space="preserve"> </w:t>
       </w:r>
       <w:proofErr w:type="spellStart"/>
+      <w:proofErr w:type="gramStart"/>
       <w:r>
         <w:rPr>
           <w:rFonts w:ascii="Courier New" w:eastAsia="Courier New" w:hAnsi="Courier New" w:cs="Courier New"/>
@@ -22671,6 +24028,7 @@
         <w:t>(</w:t>
       </w:r>
       <w:proofErr w:type="spellStart"/>
+      <w:proofErr w:type="gramEnd"/>
       <w:r>
         <w:rPr>
           <w:rFonts w:ascii="Courier New" w:eastAsia="Courier New" w:hAnsi="Courier New" w:cs="Courier New"/>
@@ -22735,7 +24093,17 @@
           <w:szCs w:val="20"/>
           <w:lang w:val="es-CO"/>
         </w:rPr>
-        <w:t>procesar_pago</w:t>
+        <w:t>procesar_</w:t>
+      </w:r>
+      <w:proofErr w:type="gramStart"/>
+      <w:r>
+        <w:rPr>
+          <w:rFonts w:ascii="Courier New" w:eastAsia="Courier New" w:hAnsi="Courier New" w:cs="Courier New"/>
+          <w:sz w:val="20"/>
+          <w:szCs w:val="20"/>
+          <w:lang w:val="es-CO"/>
+        </w:rPr>
+        <w:t>pago</w:t>
       </w:r>
       <w:proofErr w:type="spellEnd"/>
       <w:r>
@@ -22748,6 +24116,7 @@
         <w:t>(</w:t>
       </w:r>
       <w:proofErr w:type="spellStart"/>
+      <w:proofErr w:type="gramEnd"/>
       <w:r>
         <w:rPr>
           <w:rFonts w:ascii="Courier New" w:eastAsia="Courier New" w:hAnsi="Courier New" w:cs="Courier New"/>
@@ -22807,9 +24176,19 @@
           <w:sz w:val="20"/>
           <w:szCs w:val="20"/>
         </w:rPr>
-        <w:t>centavos = round(</w:t>
-      </w:r>
-      <w:proofErr w:type="spellStart"/>
+        <w:t xml:space="preserve">centavos = </w:t>
+      </w:r>
+      <w:proofErr w:type="gramStart"/>
+      <w:r>
+        <w:rPr>
+          <w:rFonts w:ascii="Courier New" w:eastAsia="Courier New" w:hAnsi="Courier New" w:cs="Courier New"/>
+          <w:sz w:val="20"/>
+          <w:szCs w:val="20"/>
+        </w:rPr>
+        <w:t>round(</w:t>
+      </w:r>
+      <w:proofErr w:type="spellStart"/>
+      <w:proofErr w:type="gramEnd"/>
       <w:r>
         <w:rPr>
           <w:rFonts w:ascii="Courier New" w:eastAsia="Courier New" w:hAnsi="Courier New" w:cs="Courier New"/>
@@ -22838,16 +24217,43 @@
           <w:sz w:val="20"/>
           <w:szCs w:val="20"/>
         </w:rPr>
-        <w:t xml:space="preserve">        charge = self._</w:t>
-      </w:r>
-      <w:proofErr w:type="spellStart"/>
-      <w:r>
-        <w:rPr>
-          <w:rFonts w:ascii="Courier New" w:eastAsia="Courier New" w:hAnsi="Courier New" w:cs="Courier New"/>
-          <w:sz w:val="20"/>
-          <w:szCs w:val="20"/>
-        </w:rPr>
-        <w:t>api.create_charge</w:t>
+        <w:t xml:space="preserve">        charge = </w:t>
+      </w:r>
+      <w:proofErr w:type="gramStart"/>
+      <w:r>
+        <w:rPr>
+          <w:rFonts w:ascii="Courier New" w:eastAsia="Courier New" w:hAnsi="Courier New" w:cs="Courier New"/>
+          <w:sz w:val="20"/>
+          <w:szCs w:val="20"/>
+        </w:rPr>
+        <w:t>self._</w:t>
+      </w:r>
+      <w:proofErr w:type="spellStart"/>
+      <w:r>
+        <w:rPr>
+          <w:rFonts w:ascii="Courier New" w:eastAsia="Courier New" w:hAnsi="Courier New" w:cs="Courier New"/>
+          <w:sz w:val="20"/>
+          <w:szCs w:val="20"/>
+        </w:rPr>
+        <w:t>api.create</w:t>
+      </w:r>
+      <w:proofErr w:type="gramEnd"/>
+      <w:r>
+        <w:rPr>
+          <w:rFonts w:ascii="Courier New" w:eastAsia="Courier New" w:hAnsi="Courier New" w:cs="Courier New"/>
+          <w:sz w:val="20"/>
+          <w:szCs w:val="20"/>
+        </w:rPr>
+        <w:t>_</w:t>
+      </w:r>
+      <w:proofErr w:type="gramStart"/>
+      <w:r>
+        <w:rPr>
+          <w:rFonts w:ascii="Courier New" w:eastAsia="Courier New" w:hAnsi="Courier New" w:cs="Courier New"/>
+          <w:sz w:val="20"/>
+          <w:szCs w:val="20"/>
+        </w:rPr>
+        <w:t>charge</w:t>
       </w:r>
       <w:proofErr w:type="spellEnd"/>
       <w:r>
@@ -22858,6 +24264,7 @@
         </w:rPr>
         <w:t>(</w:t>
       </w:r>
+      <w:proofErr w:type="gramEnd"/>
     </w:p>
     <w:p>
       <w:pPr>
@@ -22934,14 +24341,25 @@
         <w:t>metadata</w:t>
       </w:r>
       <w:proofErr w:type="spellEnd"/>
-      <w:r>
-        <w:rPr>
-          <w:rFonts w:ascii="Courier New" w:eastAsia="Courier New" w:hAnsi="Courier New" w:cs="Courier New"/>
-          <w:sz w:val="20"/>
-          <w:szCs w:val="20"/>
-          <w:lang w:val="es-CO"/>
-        </w:rPr>
-        <w:t>={"</w:t>
+      <w:proofErr w:type="gramStart"/>
+      <w:r>
+        <w:rPr>
+          <w:rFonts w:ascii="Courier New" w:eastAsia="Courier New" w:hAnsi="Courier New" w:cs="Courier New"/>
+          <w:sz w:val="20"/>
+          <w:szCs w:val="20"/>
+          <w:lang w:val="es-CO"/>
+        </w:rPr>
+        <w:t>={</w:t>
+      </w:r>
+      <w:proofErr w:type="gramEnd"/>
+      <w:r>
+        <w:rPr>
+          <w:rFonts w:ascii="Courier New" w:eastAsia="Courier New" w:hAnsi="Courier New" w:cs="Courier New"/>
+          <w:sz w:val="20"/>
+          <w:szCs w:val="20"/>
+          <w:lang w:val="es-CO"/>
+        </w:rPr>
+        <w:t>"</w:t>
       </w:r>
       <w:proofErr w:type="spellStart"/>
       <w:r>
@@ -23067,7 +24485,27 @@
           <w:szCs w:val="20"/>
           <w:lang w:val="es-CO"/>
         </w:rPr>
-        <w:t xml:space="preserve"> ResultadoPago(exitoso, </w:t>
+        <w:t xml:space="preserve"> </w:t>
+      </w:r>
+      <w:proofErr w:type="gramStart"/>
+      <w:r>
+        <w:rPr>
+          <w:rFonts w:ascii="Courier New" w:eastAsia="Courier New" w:hAnsi="Courier New" w:cs="Courier New"/>
+          <w:sz w:val="20"/>
+          <w:szCs w:val="20"/>
+          <w:lang w:val="es-CO"/>
+        </w:rPr>
+        <w:t>ResultadoPago(</w:t>
+      </w:r>
+      <w:proofErr w:type="gramEnd"/>
+      <w:r>
+        <w:rPr>
+          <w:rFonts w:ascii="Courier New" w:eastAsia="Courier New" w:hAnsi="Courier New" w:cs="Courier New"/>
+          <w:sz w:val="20"/>
+          <w:szCs w:val="20"/>
+          <w:lang w:val="es-CO"/>
+        </w:rPr>
+        <w:t xml:space="preserve">exitoso, </w:t>
       </w:r>
       <w:proofErr w:type="spellStart"/>
       <w:r>
@@ -23154,6 +24592,7 @@
         <w:t xml:space="preserve"> </w:t>
       </w:r>
       <w:proofErr w:type="spellStart"/>
+      <w:proofErr w:type="gramStart"/>
       <w:r>
         <w:rPr>
           <w:rFonts w:ascii="Courier New" w:eastAsia="Courier New" w:hAnsi="Courier New" w:cs="Courier New"/>
@@ -23174,6 +24613,7 @@
         <w:t>(</w:t>
       </w:r>
       <w:proofErr w:type="spellStart"/>
+      <w:proofErr w:type="gramEnd"/>
       <w:r>
         <w:rPr>
           <w:rFonts w:ascii="Courier New" w:eastAsia="Courier New" w:hAnsi="Courier New" w:cs="Courier New"/>
@@ -23238,7 +24678,17 @@
           <w:szCs w:val="20"/>
           <w:lang w:val="es-CO"/>
         </w:rPr>
-        <w:t>procesar_pago</w:t>
+        <w:t>procesar_</w:t>
+      </w:r>
+      <w:proofErr w:type="gramStart"/>
+      <w:r>
+        <w:rPr>
+          <w:rFonts w:ascii="Courier New" w:eastAsia="Courier New" w:hAnsi="Courier New" w:cs="Courier New"/>
+          <w:sz w:val="20"/>
+          <w:szCs w:val="20"/>
+          <w:lang w:val="es-CO"/>
+        </w:rPr>
+        <w:t>pago</w:t>
       </w:r>
       <w:proofErr w:type="spellEnd"/>
       <w:r>
@@ -23251,6 +24701,7 @@
         <w:t>(</w:t>
       </w:r>
       <w:proofErr w:type="spellStart"/>
+      <w:proofErr w:type="gramEnd"/>
       <w:r>
         <w:rPr>
           <w:rFonts w:ascii="Courier New" w:eastAsia="Courier New" w:hAnsi="Courier New" w:cs="Courier New"/>
@@ -23309,6 +24760,7 @@
         <w:t xml:space="preserve">        r = </w:t>
       </w:r>
       <w:proofErr w:type="spellStart"/>
+      <w:proofErr w:type="gramStart"/>
       <w:r>
         <w:rPr>
           <w:rFonts w:ascii="Courier New" w:eastAsia="Courier New" w:hAnsi="Courier New" w:cs="Courier New"/>
@@ -23336,17 +24788,47 @@
           <w:szCs w:val="20"/>
           <w:lang w:val="es-CO"/>
         </w:rPr>
-        <w:t>api.generar_transaccion</w:t>
-      </w:r>
-      <w:proofErr w:type="spellEnd"/>
-      <w:r>
-        <w:rPr>
-          <w:rFonts w:ascii="Courier New" w:eastAsia="Courier New" w:hAnsi="Courier New" w:cs="Courier New"/>
-          <w:sz w:val="20"/>
-          <w:szCs w:val="20"/>
-          <w:lang w:val="es-CO"/>
-        </w:rPr>
-        <w:t>(monto=monto, moneda="COP", referencia=concepto)</w:t>
+        <w:t>api.generar</w:t>
+      </w:r>
+      <w:proofErr w:type="gramEnd"/>
+      <w:r>
+        <w:rPr>
+          <w:rFonts w:ascii="Courier New" w:eastAsia="Courier New" w:hAnsi="Courier New" w:cs="Courier New"/>
+          <w:sz w:val="20"/>
+          <w:szCs w:val="20"/>
+          <w:lang w:val="es-CO"/>
+        </w:rPr>
+        <w:t>_</w:t>
+      </w:r>
+      <w:proofErr w:type="gramStart"/>
+      <w:r>
+        <w:rPr>
+          <w:rFonts w:ascii="Courier New" w:eastAsia="Courier New" w:hAnsi="Courier New" w:cs="Courier New"/>
+          <w:sz w:val="20"/>
+          <w:szCs w:val="20"/>
+          <w:lang w:val="es-CO"/>
+        </w:rPr>
+        <w:t>transaccion</w:t>
+      </w:r>
+      <w:proofErr w:type="spellEnd"/>
+      <w:r>
+        <w:rPr>
+          <w:rFonts w:ascii="Courier New" w:eastAsia="Courier New" w:hAnsi="Courier New" w:cs="Courier New"/>
+          <w:sz w:val="20"/>
+          <w:szCs w:val="20"/>
+          <w:lang w:val="es-CO"/>
+        </w:rPr>
+        <w:t>(</w:t>
+      </w:r>
+      <w:proofErr w:type="gramEnd"/>
+      <w:r>
+        <w:rPr>
+          <w:rFonts w:ascii="Courier New" w:eastAsia="Courier New" w:hAnsi="Courier New" w:cs="Courier New"/>
+          <w:sz w:val="20"/>
+          <w:szCs w:val="20"/>
+          <w:lang w:val="es-CO"/>
+        </w:rPr>
+        <w:t>monto=monto, moneda="COP", referencia=concepto)</w:t>
       </w:r>
     </w:p>
     <w:p>
@@ -23400,7 +24882,27 @@
           <w:szCs w:val="20"/>
           <w:lang w:val="es-CO"/>
         </w:rPr>
-        <w:t xml:space="preserve"> ResultadoPago(exitoso, r["</w:t>
+        <w:t xml:space="preserve"> </w:t>
+      </w:r>
+      <w:proofErr w:type="gramStart"/>
+      <w:r>
+        <w:rPr>
+          <w:rFonts w:ascii="Courier New" w:eastAsia="Courier New" w:hAnsi="Courier New" w:cs="Courier New"/>
+          <w:sz w:val="20"/>
+          <w:szCs w:val="20"/>
+          <w:lang w:val="es-CO"/>
+        </w:rPr>
+        <w:t>ResultadoPago(</w:t>
+      </w:r>
+      <w:proofErr w:type="gramEnd"/>
+      <w:r>
+        <w:rPr>
+          <w:rFonts w:ascii="Courier New" w:eastAsia="Courier New" w:hAnsi="Courier New" w:cs="Courier New"/>
+          <w:sz w:val="20"/>
+          <w:szCs w:val="20"/>
+          <w:lang w:val="es-CO"/>
+        </w:rPr>
+        <w:t>exitoso, r["</w:t>
       </w:r>
       <w:proofErr w:type="spellStart"/>
       <w:r>
@@ -23693,6 +25195,133 @@
     </w:p>
     <w:p>
       <w:pPr>
+        <w:spacing w:before="200"/>
+        <w:rPr>
+          <w:lang w:val="es-CO"/>
+        </w:rPr>
+      </w:pPr>
+      <w:bookmarkStart w:id="82" w:name="bm_fig26"/>
+      <w:r>
+        <w:rPr>
+          <w:b/>
+          <w:bCs/>
+          <w:lang w:val="es-CO"/>
+        </w:rPr>
+        <w:t>Figura 26</w:t>
+      </w:r>
+      <w:bookmarkEnd w:id="82"/>
+    </w:p>
+    <w:p>
+      <w:pPr>
+        <w:rPr>
+          <w:lang w:val="es-CO"/>
+        </w:rPr>
+      </w:pPr>
+      <w:proofErr w:type="spellStart"/>
+      <w:r>
+        <w:rPr>
+          <w:i/>
+          <w:iCs/>
+          <w:lang w:val="es-CO"/>
+        </w:rPr>
+        <w:t xml:space="preserve">Diagrama UML de clases del patrón Adapter aplicado al cobro de pagos</w:t>
+      </w:r>
+      <w:proofErr w:type="spellEnd"/>
+      <w:proofErr w:type="spellStart"/>
+      <w:proofErr w:type="spellEnd"/>
+      <w:proofErr w:type="spellStart"/>
+      <w:proofErr w:type="spellEnd"/>
+      <w:proofErr w:type="spellStart"/>
+      <w:proofErr w:type="spellEnd"/>
+    </w:p>
+    <w:p>
+      <w:pPr>
+        <w:ind w:firstLine="720"/>
+        <w:jc w:val="both"/>
+        <w:rPr>
+          <w:lang w:val="es-CO"/>
+        </w:rPr>
+      </w:pPr>
+      <w:r>
+        <w:rPr>
+          <w:noProof/>
+          <w:lang w:val="es-CO"/>
+        </w:rPr>
+        <w:drawing>
+          <wp:inline distT="0" distB="0" distL="0" distR="0" wp14:anchorId="5F5EEBBA" wp14:editId="047EACEC">
+            <wp:extent cx="5943600" cy="2453005"/>
+            <wp:effectExtent l="0" t="0" r="0" b="4445"/>
+            <wp:docPr id="1659325220" name="Imagen 1"/>
+            <wp:cNvGraphicFramePr>
+              <a:graphicFrameLocks xmlns:a="http://schemas.openxmlformats.org/drawingml/2006/main" noChangeAspect="1"/>
+            </wp:cNvGraphicFramePr>
+            <a:graphic xmlns:a="http://schemas.openxmlformats.org/drawingml/2006/main">
+              <a:graphicData uri="http://schemas.openxmlformats.org/drawingml/2006/picture">
+                <pic:pic xmlns:pic="http://schemas.openxmlformats.org/drawingml/2006/picture">
+                  <pic:nvPicPr>
+                    <pic:cNvPr id="1659325220" name="Imagen 1659325220"/>
+                    <pic:cNvPicPr/>
+                  </pic:nvPicPr>
+                  <pic:blipFill>
+                    <a:blip r:embed="rId27" cstate="print">
+                      <a:extLst>
+                        <a:ext uri="{28A0092B-C50C-407E-A947-70E740481C1C}">
+                          <a14:useLocalDpi xmlns:a14="http://schemas.microsoft.com/office/drawing/2010/main" val="0"/>
+                        </a:ext>
+                      </a:extLst>
+                    </a:blip>
+                    <a:stretch>
+                      <a:fillRect/>
+                    </a:stretch>
+                  </pic:blipFill>
+                  <pic:spPr>
+                    <a:xfrm>
+                      <a:off x="0" y="0"/>
+                      <a:ext cx="5943600" cy="2453005"/>
+                    </a:xfrm>
+                    <a:prstGeom prst="rect">
+                      <a:avLst/>
+                    </a:prstGeom>
+                  </pic:spPr>
+                </pic:pic>
+              </a:graphicData>
+            </a:graphic>
+          </wp:inline>
+        </w:drawing>
+      </w:r>
+    </w:p>
+    <w:p>
+      <w:pPr>
+        <w:spacing w:before="120"/>
+        <w:rPr>
+          <w:lang w:val="es-CO"/>
+        </w:rPr>
+      </w:pPr>
+      <w:r>
+        <w:rPr>
+          <w:i/>
+          <w:iCs/>
+          <w:lang w:val="es-CO"/>
+        </w:rPr>
+        <w:t xml:space="preserve">Nota. </w:t>
+      </w:r>
+      <w:r>
+        <w:rPr>
+          <w:lang w:val="es-CO"/>
+        </w:rPr>
+        <w:t xml:space="preserve">Diagrama de clases generado a partir de Documentacion/Semana 7/adapter.py, mostrando la interfaz PasarelaPago, los adaptadores AdaptadorStripe y AdaptadorPayU, los SDKs externos simulados (StripeAPI, PayUAPI) y el objeto de valor uniforme ResultadoPago que ambos adaptadores producen.</w:t>
+      </w:r>
+      <w:proofErr w:type="spellStart"/>
+      <w:proofErr w:type="spellEnd"/>
+      <w:proofErr w:type="spellStart"/>
+      <w:proofErr w:type="spellEnd"/>
+      <w:proofErr w:type="spellStart"/>
+      <w:proofErr w:type="spellEnd"/>
+      <w:proofErr w:type="spellStart"/>
+      <w:proofErr w:type="spellEnd"/>
+    </w:p>
+    <w:p>
+      <w:pPr>
         <w:pStyle w:val="Ttulo3"/>
         <w:spacing w:before="200" w:after="100" w:line="480" w:lineRule="auto"/>
         <w:rPr>
@@ -23984,8 +25613,7 @@
         <w:rPr>
           <w:lang w:val="es-CO"/>
         </w:rPr>
-        <w:lastRenderedPageBreak/>
-        <w:t xml:space="preserve">Además de las pruebas unitarias, el funcionamiento del patrón se validó de manera funcional desde la interfaz. La Figura 26 muestra la pestaña Pagos de la plataforma </w:t>
+        <w:t xml:space="preserve">Además de las pruebas unitarias, el funcionamiento del patrón se validó de manera funcional desde la interfaz. La Figura 27 muestra la pestaña Pagos de la plataforma </w:t>
       </w:r>
       <w:proofErr w:type="spellStart"/>
       <w:r>
@@ -24002,6 +25630,7 @@
         <w:t xml:space="preserve"> antes de ejecutar ninguna subasta: la pasarela PayU seleccionada y el historial de cobros todavía </w:t>
       </w:r>
       <w:proofErr w:type="spellStart"/>
+      <w:proofErr w:type="gramStart"/>
       <w:r>
         <w:rPr>
           <w:lang w:val="es-CO"/>
@@ -24009,6 +25638,7 @@
         <w:t>vacío.implica</w:t>
       </w:r>
       <w:proofErr w:type="spellEnd"/>
+      <w:proofErr w:type="gramEnd"/>
       <w:r>
         <w:rPr>
           <w:lang w:val="es-CO"/>
@@ -24023,14 +25653,14 @@
           <w:lang w:val="es-CO"/>
         </w:rPr>
       </w:pPr>
-      <w:bookmarkStart w:id="76" w:name="bm_fig26"/>
+      <w:bookmarkStart w:id="76" w:name="bm_fig27"/>
       <w:r>
         <w:rPr>
           <w:b/>
           <w:bCs/>
           <w:lang w:val="es-CO"/>
         </w:rPr>
-        <w:t>Figura 26</w:t>
+        <w:t>Figura 27</w:t>
       </w:r>
       <w:bookmarkEnd w:id="76"/>
     </w:p>
@@ -24062,6 +25692,7 @@
           <w:noProof/>
           <w:lang w:val="es-CO"/>
         </w:rPr>
+        <w:lastRenderedPageBreak/>
         <w:drawing>
           <wp:inline distT="0" distB="0" distL="0" distR="0" wp14:anchorId="0BF242C1" wp14:editId="17102336">
             <wp:extent cx="5943600" cy="3556635"/>
@@ -24078,7 +25709,7 @@
                     <pic:cNvPicPr/>
                   </pic:nvPicPr>
                   <pic:blipFill>
-                    <a:blip r:embed="rId27"/>
+                    <a:blip r:embed="rId28"/>
                     <a:stretch>
                       <a:fillRect/>
                     </a:stretch>
@@ -24147,10 +25778,10 @@
         <w:rPr>
           <w:lang w:val="es-CO"/>
         </w:rPr>
-        <w:lastRenderedPageBreak/>
-        <w:t xml:space="preserve">Al cambiar a la pasarela Stripe y ejecutar una subasta desde la pestaña Mercado, la Figura 27 confirma que la transacción cerrada se cobra automáticamente por ese </w:t>
-      </w:r>
-      <w:proofErr w:type="spellStart"/>
+        <w:t xml:space="preserve">Al cambiar a la pasarela Stripe y ejecutar una subasta desde la pestaña Mercado, la Figura 28 confirma que la transacción cerrada se cobra automáticamente por ese </w:t>
+      </w:r>
+      <w:proofErr w:type="spellStart"/>
+      <w:proofErr w:type="gramStart"/>
       <w:r>
         <w:rPr>
           <w:lang w:val="es-CO"/>
@@ -24158,6 +25789,7 @@
         <w:t>adaptador.implica</w:t>
       </w:r>
       <w:proofErr w:type="spellEnd"/>
+      <w:proofErr w:type="gramEnd"/>
       <w:r>
         <w:rPr>
           <w:lang w:val="es-CO"/>
@@ -24172,14 +25804,14 @@
           <w:lang w:val="es-CO"/>
         </w:rPr>
       </w:pPr>
-      <w:bookmarkStart w:id="77" w:name="bm_fig27"/>
+      <w:bookmarkStart w:id="77" w:name="bm_fig28"/>
       <w:r>
         <w:rPr>
           <w:b/>
           <w:bCs/>
           <w:lang w:val="es-CO"/>
         </w:rPr>
-        <w:t>Figura 27</w:t>
+        <w:t>Figura 28</w:t>
       </w:r>
       <w:bookmarkEnd w:id="77"/>
     </w:p>
@@ -24211,6 +25843,7 @@
           <w:noProof/>
           <w:lang w:val="es-CO"/>
         </w:rPr>
+        <w:lastRenderedPageBreak/>
         <w:drawing>
           <wp:inline distT="0" distB="0" distL="0" distR="0" wp14:anchorId="52503A4B" wp14:editId="4259AC21">
             <wp:extent cx="5943600" cy="3537585"/>
@@ -24227,7 +25860,7 @@
                     <pic:cNvPicPr/>
                   </pic:nvPicPr>
                   <pic:blipFill>
-                    <a:blip r:embed="rId28"/>
+                    <a:blip r:embed="rId29"/>
                     <a:stretch>
                       <a:fillRect/>
                     </a:stretch>
@@ -24282,9 +25915,10 @@
         <w:rPr>
           <w:lang w:val="es-CO"/>
         </w:rPr>
-        <w:t xml:space="preserve">La Figura 28 muestra la pestaña Mercado tras varias subastas ejecutadas: el libro de órdenes y las transacciones cerradas que disparan cada </w:t>
-      </w:r>
-      <w:proofErr w:type="spellStart"/>
+        <w:t xml:space="preserve">La Figura 29 muestra la pestaña Mercado tras varias subastas ejecutadas: el libro de órdenes y las transacciones cerradas que disparan cada </w:t>
+      </w:r>
+      <w:proofErr w:type="spellStart"/>
+      <w:proofErr w:type="gramStart"/>
       <w:r>
         <w:rPr>
           <w:lang w:val="es-CO"/>
@@ -24292,18 +25926,12 @@
         <w:t>cobro.implica</w:t>
       </w:r>
       <w:proofErr w:type="spellEnd"/>
-      <w:r>
-        <w:rPr>
-          <w:lang w:val="es-CO"/>
-        </w:rPr>
-        <w:t xml:space="preserve"> integrarse con al menos </w:t>
-      </w:r>
-      <w:r>
-        <w:rPr>
-          <w:lang w:val="es-CO"/>
-        </w:rPr>
-        <w:lastRenderedPageBreak/>
-        <w:t>una pasarela externa cuya interfaz la plataforma no controla ni puede modificar. Envolver cada SDK en un adaptador propio mantiene la lógica de la subasta y del cobro completamente separada de los detalles de cada proveedor, y permite migrar de pasarela o soportar varias sin arriesgar el resto del sistema.</w:t>
+      <w:proofErr w:type="gramEnd"/>
+      <w:r>
+        <w:rPr>
+          <w:lang w:val="es-CO"/>
+        </w:rPr>
+        <w:t xml:space="preserve"> integrarse con al menos una pasarela externa cuya interfaz la plataforma no controla ni puede modificar. Envolver cada SDK en un adaptador propio mantiene la lógica de la subasta y del cobro completamente separada de los detalles de cada proveedor, y permite migrar de pasarela o soportar varias sin arriesgar el resto del sistema.</w:t>
       </w:r>
     </w:p>
     <w:p>
@@ -24313,14 +25941,14 @@
           <w:lang w:val="es-CO"/>
         </w:rPr>
       </w:pPr>
-      <w:bookmarkStart w:id="78" w:name="bm_fig28"/>
+      <w:bookmarkStart w:id="78" w:name="bm_fig29"/>
       <w:r>
         <w:rPr>
           <w:b/>
           <w:bCs/>
           <w:lang w:val="es-CO"/>
         </w:rPr>
-        <w:t>Figura 28</w:t>
+        <w:t>Figura 29</w:t>
       </w:r>
       <w:bookmarkEnd w:id="78"/>
     </w:p>
@@ -24352,6 +25980,7 @@
           <w:noProof/>
           <w:lang w:val="es-CO"/>
         </w:rPr>
+        <w:lastRenderedPageBreak/>
         <w:drawing>
           <wp:inline distT="0" distB="0" distL="0" distR="0" wp14:anchorId="697A072A" wp14:editId="6701DA16">
             <wp:extent cx="5943600" cy="3565525"/>
@@ -24368,7 +25997,7 @@
                     <pic:cNvPicPr/>
                   </pic:nvPicPr>
                   <pic:blipFill>
-                    <a:blip r:embed="rId29"/>
+                    <a:blip r:embed="rId30"/>
                     <a:stretch>
                       <a:fillRect/>
                     </a:stretch>
@@ -24437,9 +26066,10 @@
         <w:rPr>
           <w:lang w:val="es-CO"/>
         </w:rPr>
-        <w:t xml:space="preserve">Por último, la Figura 29 evidencia que la plataforma puede cobrar con ambas pasarelas sin distinguirlas: tras cambiar de Stripe a PayU y ejecutar más subastas, la misma bandeja de pagos acumula cobros de las dos, todos con el mismo formato </w:t>
-      </w:r>
-      <w:proofErr w:type="spellStart"/>
+        <w:t xml:space="preserve">Por último, la Figura 30 evidencia que la plataforma puede cobrar con ambas pasarelas sin distinguirlas: tras cambiar de Stripe a PayU y ejecutar más subastas, la misma bandeja de pagos acumula cobros de las dos, todos con el mismo formato </w:t>
+      </w:r>
+      <w:proofErr w:type="spellStart"/>
+      <w:proofErr w:type="gramStart"/>
       <w:r>
         <w:rPr>
           <w:lang w:val="es-CO"/>
@@ -24447,18 +26077,12 @@
         <w:t>uniforme.implica</w:t>
       </w:r>
       <w:proofErr w:type="spellEnd"/>
-      <w:r>
-        <w:rPr>
-          <w:lang w:val="es-CO"/>
-        </w:rPr>
-        <w:t xml:space="preserve"> integrarse con </w:t>
-      </w:r>
-      <w:r>
-        <w:rPr>
-          <w:lang w:val="es-CO"/>
-        </w:rPr>
-        <w:lastRenderedPageBreak/>
-        <w:t>al menos una pasarela externa cuya interfaz la plataforma no controla ni puede modificar. Envolver cada SDK en un adaptador propio mantiene la lógica de la subasta y del cobro completamente separada de los detalles de cada proveedor, y permite migrar de pasarela o soportar varias sin arriesgar el resto del sistema.</w:t>
+      <w:proofErr w:type="gramEnd"/>
+      <w:r>
+        <w:rPr>
+          <w:lang w:val="es-CO"/>
+        </w:rPr>
+        <w:t xml:space="preserve"> integrarse con al menos una pasarela externa cuya interfaz la plataforma no controla ni puede modificar. Envolver cada SDK en un adaptador propio mantiene la lógica de la subasta y del cobro completamente separada de los detalles de cada proveedor, y permite migrar de pasarela o soportar varias sin arriesgar el resto del sistema.</w:t>
       </w:r>
     </w:p>
     <w:p>
@@ -24468,14 +26092,14 @@
           <w:lang w:val="es-CO"/>
         </w:rPr>
       </w:pPr>
-      <w:bookmarkStart w:id="79" w:name="bm_fig29"/>
+      <w:bookmarkStart w:id="79" w:name="bm_fig30"/>
       <w:r>
         <w:rPr>
           <w:b/>
           <w:bCs/>
           <w:lang w:val="es-CO"/>
         </w:rPr>
-        <w:t>Figura 29</w:t>
+        <w:t>Figura 30</w:t>
       </w:r>
       <w:bookmarkEnd w:id="79"/>
     </w:p>
@@ -24507,6 +26131,7 @@
           <w:noProof/>
           <w:lang w:val="es-CO"/>
         </w:rPr>
+        <w:lastRenderedPageBreak/>
         <w:drawing>
           <wp:inline distT="0" distB="0" distL="0" distR="0" wp14:anchorId="6F47D1A5" wp14:editId="0B8483F6">
             <wp:extent cx="5943600" cy="3571875"/>
@@ -24523,7 +26148,7 @@
                     <pic:cNvPicPr/>
                   </pic:nvPicPr>
                   <pic:blipFill>
-                    <a:blip r:embed="rId30"/>
+                    <a:blip r:embed="rId31"/>
                     <a:stretch>
                       <a:fillRect/>
                     </a:stretch>
@@ -24587,31 +26212,15 @@
           <w:lang w:val="es-CO"/>
         </w:rPr>
       </w:pPr>
-      <w:r>
-        <w:fldChar w:fldCharType="begin"/>
-      </w:r>
-      <w:r>
-        <w:rPr>
-          <w:lang w:val="es-CO"/>
-        </w:rPr>
-        <w:instrText>HYPERLINK "https://unidadestecno-my.sharepoint.com/:f:/g/personal/jsferreira_uts_edu_co/IgBa21YC0G3dSb9NlCxD1pC-AeifTZU7r5jjf2-aL0my62s?e=wKdeKn"</w:instrText>
-      </w:r>
-      <w:r>
-        <w:fldChar w:fldCharType="separate"/>
-      </w:r>
-      <w:r>
-        <w:rPr>
-          <w:rStyle w:val="Hipervnculo"/>
-          <w:lang w:val="es-CO"/>
-        </w:rPr>
-        <w:t>Semana 7</w:t>
-      </w:r>
-      <w:r>
-        <w:rPr>
-          <w:lang w:val="es-CO"/>
-        </w:rPr>
-        <w:fldChar w:fldCharType="end"/>
-      </w:r>
+      <w:hyperlink r:id="rId32" w:history="1">
+        <w:r>
+          <w:rPr>
+            <w:rStyle w:val="Hipervnculo"/>
+            <w:lang w:val="es-CO"/>
+          </w:rPr>
+          <w:t>Semana 7</w:t>
+        </w:r>
+      </w:hyperlink>
     </w:p>
     <w:p>
       <w:pPr>
@@ -24646,7 +26255,6 @@
           <w:color w:val="000000"/>
           <w:lang w:val="es-CO"/>
         </w:rPr>
-        <w:lastRenderedPageBreak/>
         <w:t>Conclusión</w:t>
       </w:r>
       <w:bookmarkEnd w:id="80"/>
@@ -24691,7 +26299,14 @@
         <w:rPr>
           <w:lang w:val="es-CO"/>
         </w:rPr>
-        <w:t xml:space="preserve"> Factory garantiza que cada canal de notificación genere la familia completa de avisos con un formato coherente, el </w:t>
+        <w:t xml:space="preserve"> Factory garantiza que cada canal de notificación genere la familia completa de avisos con un formato </w:t>
+      </w:r>
+      <w:r>
+        <w:rPr>
+          <w:lang w:val="es-CO"/>
+        </w:rPr>
+        <w:lastRenderedPageBreak/>
+        <w:t xml:space="preserve">coherente, el </w:t>
       </w:r>
       <w:proofErr w:type="spellStart"/>
       <w:r>
@@ -24931,7 +26546,7 @@
       </w:r>
     </w:p>
     <w:sectPr>
-      <w:headerReference w:type="default" r:id="rId31"/>
+      <w:headerReference w:type="default" r:id="rId33"/>
       <w:pgSz w:w="12240" w:h="15840"/>
       <w:pgMar w:top="1440" w:right="1440" w:bottom="1440" w:left="1440" w:header="708" w:footer="708" w:gutter="0"/>
       <w:cols w:space="720"/>
@@ -25648,6 +27263,7 @@
   <w:style w:type="character" w:default="1" w:styleId="Fuentedeprrafopredeter">
     <w:name w:val="Default Paragraph Font"/>
     <w:uiPriority w:val="1"/>
+    <w:semiHidden/>
     <w:unhideWhenUsed/>
   </w:style>
   <w:style w:type="table" w:default="1" w:styleId="Tablanormal">
@@ -25785,6 +27401,18 @@
     <w:rPr>
       <w:color w:val="605E5C"/>
       <w:shd w:val="clear" w:color="auto" w:fill="E1DFDD"/>
+    </w:rPr>
+  </w:style>
+  <w:style w:type="character" w:styleId="Hipervnculovisitado">
+    <w:name w:val="FollowedHyperlink"/>
+    <w:basedOn w:val="Fuentedeprrafopredeter"/>
+    <w:uiPriority w:val="99"/>
+    <w:semiHidden/>
+    <w:unhideWhenUsed/>
+    <w:rsid w:val="00E3062D"/>
+    <w:rPr>
+      <w:color w:val="954F72" w:themeColor="followedHyperlink"/>
+      <w:u w:val="single"/>
     </w:rPr>
   </w:style>
 </w:styles>

</xml_diff>